<commit_message>
Support de soutenance : PowerPoint (.pptx) + trame .docx alignée (18 slides)
- Nouveau générateur PowerPoint (build-pptx.js, pptxgenjs) + .pptx présentable,
  charte NeoTravel teal
- Plan retravaillé pour le Bloc C : objectifs/attentes initiales, choix
  techniques justifiés, prévu vs réalisé, mapping attentes→réponses, section
  « ce qui fonctionne », ouverture V2 & passation
- .docx (build.js) régénéré pour refléter la même structure 18 slides
- README livrables : lien .pptx + commande de génération

Co-Authored-By: Claude Opus 4.8 <noreply@anthropic.com>
</commit_message>
<xml_diff>
--- a/livrables/support-de-soutenance/Support-de-soutenance-NeoTravel.docx
+++ b/livrables/support-de-soutenance/Support-de-soutenance-NeoTravel.docx
@@ -224,7 +224,7 @@
         <w:t xml:space="preserve">chaque membre intervient</w:t>
       </w:r>
       <w:r>
-        <w:t xml:space="preserve">. À mettre en forme dans l’outil de slides de votre choix (ou à présenter tel quel en PDF).</w:t>
+        <w:t xml:space="preserve">. Ce document est le miroir du PowerPoint (build-pptx.js) ; présentez le .pptx, ce .docx sert de script.</w:t>
       </w:r>
     </w:p>
     <w:p>
@@ -298,9 +298,9 @@
         </w:tblBorders>
       </w:tblPr>
       <w:tblGrid>
-        <w:gridCol w:w="3200"/>
-        <w:gridCol w:w="3360"/>
-        <w:gridCol w:w="2800"/>
+        <w:gridCol w:w="3600"/>
+        <w:gridCol w:w="3160"/>
+        <w:gridCol w:w="2600"/>
       </w:tblGrid>
       <w:tr>
         <w:trPr>
@@ -308,7 +308,7 @@
         </w:trPr>
         <w:tc>
           <w:tcPr>
-            <w:tcW w:type="dxa" w:w="3200"/>
+            <w:tcW w:type="dxa" w:w="3600"/>
             <w:shd w:fill="D9F0EA" w:val="clear"/>
             <w:tcMar>
               <w:top w:type="dxa" w:w="60"/>
@@ -335,7 +335,7 @@
         </w:tc>
         <w:tc>
           <w:tcPr>
-            <w:tcW w:type="dxa" w:w="3360"/>
+            <w:tcW w:type="dxa" w:w="3160"/>
             <w:shd w:fill="D9F0EA" w:val="clear"/>
             <w:tcMar>
               <w:top w:type="dxa" w:w="60"/>
@@ -362,7 +362,7 @@
         </w:tc>
         <w:tc>
           <w:tcPr>
-            <w:tcW w:type="dxa" w:w="2800"/>
+            <w:tcW w:type="dxa" w:w="2600"/>
             <w:shd w:fill="D9F0EA" w:val="clear"/>
             <w:tcMar>
               <w:top w:type="dxa" w:w="60"/>
@@ -391,7 +391,7 @@
       <w:tr>
         <w:tc>
           <w:tcPr>
-            <w:tcW w:type="dxa" w:w="3200"/>
+            <w:tcW w:type="dxa" w:w="3600"/>
             <w:shd w:fill="FFFFFF" w:val="clear"/>
             <w:tcMar>
               <w:top w:type="dxa" w:w="60"/>
@@ -412,13 +412,13 @@
                 <w:bCs w:val="false"/>
                 <w:color w:val="000000"/>
               </w:rPr>
-              <w:t xml:space="preserve">Problème &amp; solution</w:t>
-            </w:r>
-          </w:p>
-        </w:tc>
-        <w:tc>
-          <w:tcPr>
-            <w:tcW w:type="dxa" w:w="3360"/>
+              <w:t xml:space="preserve">Problème, objectifs &amp; solution</w:t>
+            </w:r>
+          </w:p>
+        </w:tc>
+        <w:tc>
+          <w:tcPr>
+            <w:tcW w:type="dxa" w:w="3160"/>
             <w:shd w:fill="FFFFFF" w:val="clear"/>
             <w:tcMar>
               <w:top w:type="dxa" w:w="60"/>
@@ -445,7 +445,7 @@
         </w:tc>
         <w:tc>
           <w:tcPr>
-            <w:tcW w:type="dxa" w:w="2800"/>
+            <w:tcW w:type="dxa" w:w="2600"/>
             <w:shd w:fill="FFFFFF" w:val="clear"/>
             <w:tcMar>
               <w:top w:type="dxa" w:w="60"/>
@@ -466,7 +466,7 @@
                 <w:bCs w:val="false"/>
                 <w:color w:val="000000"/>
               </w:rPr>
-              <w:t xml:space="preserve">1 → 4</w:t>
+              <w:t xml:space="preserve">1 → 5, 9</w:t>
             </w:r>
           </w:p>
         </w:tc>
@@ -474,7 +474,7 @@
       <w:tr>
         <w:tc>
           <w:tcPr>
-            <w:tcW w:type="dxa" w:w="3200"/>
+            <w:tcW w:type="dxa" w:w="3600"/>
             <w:shd w:fill="F2F8F6" w:val="clear"/>
             <w:tcMar>
               <w:top w:type="dxa" w:w="60"/>
@@ -495,13 +495,13 @@
                 <w:bCs w:val="false"/>
                 <w:color w:val="000000"/>
               </w:rPr>
-              <w:t xml:space="preserve">Démo live (parcours complet)</w:t>
-            </w:r>
-          </w:p>
-        </w:tc>
-        <w:tc>
-          <w:tcPr>
-            <w:tcW w:type="dxa" w:w="3360"/>
+              <w:t xml:space="preserve">Choix techniques, fiabilité, prévu vs réalisé</w:t>
+            </w:r>
+          </w:p>
+        </w:tc>
+        <w:tc>
+          <w:tcPr>
+            <w:tcW w:type="dxa" w:w="3160"/>
             <w:shd w:fill="F2F8F6" w:val="clear"/>
             <w:tcMar>
               <w:top w:type="dxa" w:w="60"/>
@@ -522,13 +522,13 @@
                 <w:bCs w:val="false"/>
                 <w:color w:val="000000"/>
               </w:rPr>
-              <w:t xml:space="preserve">Zakaria TOUAMI</w:t>
-            </w:r>
-          </w:p>
-        </w:tc>
-        <w:tc>
-          <w:tcPr>
-            <w:tcW w:type="dxa" w:w="2800"/>
+              <w:t xml:space="preserve">Vincent CONTER</w:t>
+            </w:r>
+          </w:p>
+        </w:tc>
+        <w:tc>
+          <w:tcPr>
+            <w:tcW w:type="dxa" w:w="2600"/>
             <w:shd w:fill="F2F8F6" w:val="clear"/>
             <w:tcMar>
               <w:top w:type="dxa" w:w="60"/>
@@ -549,7 +549,7 @@
                 <w:bCs w:val="false"/>
                 <w:color w:val="000000"/>
               </w:rPr>
-              <w:t xml:space="preserve">5 → 8</w:t>
+              <w:t xml:space="preserve">6 → 8</w:t>
             </w:r>
           </w:p>
         </w:tc>
@@ -557,7 +557,7 @@
       <w:tr>
         <w:tc>
           <w:tcPr>
-            <w:tcW w:type="dxa" w:w="3200"/>
+            <w:tcW w:type="dxa" w:w="3600"/>
             <w:shd w:fill="FFFFFF" w:val="clear"/>
             <w:tcMar>
               <w:top w:type="dxa" w:w="60"/>
@@ -578,13 +578,13 @@
                 <w:bCs w:val="false"/>
                 <w:color w:val="000000"/>
               </w:rPr>
-              <w:t xml:space="preserve">Fiabilité, choix techniques, limites</w:t>
-            </w:r>
-          </w:p>
-        </w:tc>
-        <w:tc>
-          <w:tcPr>
-            <w:tcW w:type="dxa" w:w="3360"/>
+              <w:t xml:space="preserve">Démo live (parcours complet)</w:t>
+            </w:r>
+          </w:p>
+        </w:tc>
+        <w:tc>
+          <w:tcPr>
+            <w:tcW w:type="dxa" w:w="3160"/>
             <w:shd w:fill="FFFFFF" w:val="clear"/>
             <w:tcMar>
               <w:top w:type="dxa" w:w="60"/>
@@ -605,13 +605,13 @@
                 <w:bCs w:val="false"/>
                 <w:color w:val="000000"/>
               </w:rPr>
-              <w:t xml:space="preserve">Vincent CONTER</w:t>
-            </w:r>
-          </w:p>
-        </w:tc>
-        <w:tc>
-          <w:tcPr>
-            <w:tcW w:type="dxa" w:w="2800"/>
+              <w:t xml:space="preserve">Zakaria TOUAMI</w:t>
+            </w:r>
+          </w:p>
+        </w:tc>
+        <w:tc>
+          <w:tcPr>
+            <w:tcW w:type="dxa" w:w="2600"/>
             <w:shd w:fill="FFFFFF" w:val="clear"/>
             <w:tcMar>
               <w:top w:type="dxa" w:w="60"/>
@@ -632,7 +632,7 @@
                 <w:bCs w:val="false"/>
                 <w:color w:val="000000"/>
               </w:rPr>
-              <w:t xml:space="preserve">9 → 12</w:t>
+              <w:t xml:space="preserve">10 → 14</w:t>
             </w:r>
           </w:p>
         </w:tc>
@@ -640,7 +640,7 @@
       <w:tr>
         <w:tc>
           <w:tcPr>
-            <w:tcW w:type="dxa" w:w="3200"/>
+            <w:tcW w:type="dxa" w:w="3600"/>
             <w:shd w:fill="F2F8F6" w:val="clear"/>
             <w:tcMar>
               <w:top w:type="dxa" w:w="60"/>
@@ -661,14 +661,97 @@
                 <w:bCs w:val="false"/>
                 <w:color w:val="000000"/>
               </w:rPr>
+              <w:t xml:space="preserve">Limites, coûts, ouverture &amp; passation</w:t>
+            </w:r>
+          </w:p>
+        </w:tc>
+        <w:tc>
+          <w:tcPr>
+            <w:tcW w:type="dxa" w:w="3160"/>
+            <w:shd w:fill="F2F8F6" w:val="clear"/>
+            <w:tcMar>
+              <w:top w:type="dxa" w:w="60"/>
+              <w:left w:type="dxa" w:w="110"/>
+              <w:bottom w:type="dxa" w:w="60"/>
+              <w:right w:type="dxa" w:w="110"/>
+            </w:tcMar>
+            <w:vAlign w:val="center"/>
+          </w:tcPr>
+          <w:p>
+            <w:pPr>
+              <w:spacing w:after="0"/>
+              <w:jc w:val="left"/>
+            </w:pPr>
+            <w:r>
+              <w:rPr>
+                <w:b w:val="false"/>
+                <w:bCs w:val="false"/>
+                <w:color w:val="000000"/>
+              </w:rPr>
+              <w:t xml:space="preserve">Vincent CONTER</w:t>
+            </w:r>
+          </w:p>
+        </w:tc>
+        <w:tc>
+          <w:tcPr>
+            <w:tcW w:type="dxa" w:w="2600"/>
+            <w:shd w:fill="F2F8F6" w:val="clear"/>
+            <w:tcMar>
+              <w:top w:type="dxa" w:w="60"/>
+              <w:left w:type="dxa" w:w="110"/>
+              <w:bottom w:type="dxa" w:w="60"/>
+              <w:right w:type="dxa" w:w="110"/>
+            </w:tcMar>
+            <w:vAlign w:val="center"/>
+          </w:tcPr>
+          <w:p>
+            <w:pPr>
+              <w:spacing w:after="0"/>
+              <w:jc w:val="left"/>
+            </w:pPr>
+            <w:r>
+              <w:rPr>
+                <w:b w:val="false"/>
+                <w:bCs w:val="false"/>
+                <w:color w:val="000000"/>
+              </w:rPr>
+              <w:t xml:space="preserve">15 → 16</w:t>
+            </w:r>
+          </w:p>
+        </w:tc>
+      </w:tr>
+      <w:tr>
+        <w:tc>
+          <w:tcPr>
+            <w:tcW w:type="dxa" w:w="3600"/>
+            <w:shd w:fill="FFFFFF" w:val="clear"/>
+            <w:tcMar>
+              <w:top w:type="dxa" w:w="60"/>
+              <w:left w:type="dxa" w:w="110"/>
+              <w:bottom w:type="dxa" w:w="60"/>
+              <w:right w:type="dxa" w:w="110"/>
+            </w:tcMar>
+            <w:vAlign w:val="center"/>
+          </w:tcPr>
+          <w:p>
+            <w:pPr>
+              <w:spacing w:after="0"/>
+              <w:jc w:val="left"/>
+            </w:pPr>
+            <w:r>
+              <w:rPr>
+                <w:b w:val="false"/>
+                <w:bCs w:val="false"/>
+                <w:color w:val="000000"/>
+              </w:rPr>
               <w:t xml:space="preserve">Clôture &amp; Q&amp;R</w:t>
             </w:r>
           </w:p>
         </w:tc>
         <w:tc>
           <w:tcPr>
-            <w:tcW w:type="dxa" w:w="3360"/>
-            <w:shd w:fill="F2F8F6" w:val="clear"/>
+            <w:tcW w:type="dxa" w:w="3160"/>
+            <w:shd w:fill="FFFFFF" w:val="clear"/>
             <w:tcMar>
               <w:top w:type="dxa" w:w="60"/>
               <w:left w:type="dxa" w:w="110"/>
@@ -694,33 +777,49 @@
         </w:tc>
         <w:tc>
           <w:tcPr>
-            <w:tcW w:type="dxa" w:w="2800"/>
-            <w:shd w:fill="F2F8F6" w:val="clear"/>
-            <w:tcMar>
-              <w:top w:type="dxa" w:w="60"/>
-              <w:left w:type="dxa" w:w="110"/>
-              <w:bottom w:type="dxa" w:w="60"/>
-              <w:right w:type="dxa" w:w="110"/>
-            </w:tcMar>
-            <w:vAlign w:val="center"/>
-          </w:tcPr>
-          <w:p>
-            <w:pPr>
-              <w:spacing w:after="0"/>
-              <w:jc w:val="left"/>
-            </w:pPr>
-            <w:r>
-              <w:rPr>
-                <w:b w:val="false"/>
-                <w:bCs w:val="false"/>
-                <w:color w:val="000000"/>
-              </w:rPr>
-              <w:t xml:space="preserve">13</w:t>
+            <w:tcW w:type="dxa" w:w="2600"/>
+            <w:shd w:fill="FFFFFF" w:val="clear"/>
+            <w:tcMar>
+              <w:top w:type="dxa" w:w="60"/>
+              <w:left w:type="dxa" w:w="110"/>
+              <w:bottom w:type="dxa" w:w="60"/>
+              <w:right w:type="dxa" w:w="110"/>
+            </w:tcMar>
+            <w:vAlign w:val="center"/>
+          </w:tcPr>
+          <w:p>
+            <w:pPr>
+              <w:spacing w:after="0"/>
+              <w:jc w:val="left"/>
+            </w:pPr>
+            <w:r>
+              <w:rPr>
+                <w:b w:val="false"/>
+                <w:bCs w:val="false"/>
+                <w:color w:val="000000"/>
+              </w:rPr>
+              <w:t xml:space="preserve">17</w:t>
             </w:r>
           </w:p>
         </w:tc>
       </w:tr>
     </w:tbl>
+    <w:p>
+      <w:pPr>
+        <w:pStyle w:val="Heading2"/>
+      </w:pPr>
+      <w:r>
+        <w:t xml:space="preserve">Plan &amp; ordre logique</w:t>
+      </w:r>
+    </w:p>
+    <w:p>
+      <w:pPr>
+        <w:spacing w:after="120"/>
+      </w:pPr>
+      <w:r>
+        <w:t xml:space="preserve">Objectifs → contexte → solution → choix techniques justifiés → prévu vs réalisé → correspondance attentes/réponses → démo (ce qui fonctionne) → limites &amp; ouverture → conclusion.</w:t>
+      </w:r>
+    </w:p>
     <w:p>
       <w:r>
         <w:br w:type="page"/>
@@ -784,7 +883,7 @@
         <w:spacing w:after="60"/>
       </w:pPr>
       <w:r>
-        <w:t xml:space="preserve">Cas d’étude MBA1 — InterstellLabs.</w:t>
+        <w:t xml:space="preserve">Cas d’étude MBA1 — InterstellLabs · 1ᵉʳ juillet 2026.</w:t>
       </w:r>
     </w:p>
     <w:p>
@@ -817,7 +916,7 @@
         <w:t xml:space="preserve">À dire : </w:t>
       </w:r>
       <w:r>
-        <w:t xml:space="preserve">Se présenter brièvement et annoncer le plan : problème, solution, démo live, choix techniques, limites, questions.</w:t>
+        <w:t xml:space="preserve">Se présenter brièvement et annoncer le plan : objectifs du client → contexte → solution → choix techniques → prévu vs réalisé → démo live → ouverture &amp; passation → questions. Annoncer la règle d’or dès l’ouverture.</w:t>
       </w:r>
     </w:p>
     <w:p>
@@ -825,7 +924,7 @@
         <w:pStyle w:val="Heading1"/>
       </w:pPr>
       <w:r>
-        <w:t xml:space="preserve">Slide 2 — Le problème</w:t>
+        <w:t xml:space="preserve">Slide 2 — Objectifs &amp; attentes initiales du client</w:t>
       </w:r>
     </w:p>
     <w:p>
@@ -852,7 +951,7 @@
         <w:t xml:space="preserve">Durée : </w:t>
       </w:r>
       <w:r>
-        <w:t xml:space="preserve">2 min</w:t>
+        <w:t xml:space="preserve">1,5 min</w:t>
       </w:r>
     </w:p>
     <w:p>
@@ -865,7 +964,7 @@
           <w:iCs/>
           <w:color w:val="666666"/>
         </w:rPr>
-        <w:t xml:space="preserve">NeoTravel reçoit ~60 leads/jour — l’acquisition n’est pas le problème, l’exploitation l’est.</w:t>
+        <w:t xml:space="preserve">Le cadre posé AVANT d’écrire la première ligne de code (dossier de cadrage L1).</w:t>
       </w:r>
     </w:p>
     <w:p>
@@ -878,7 +977,7 @@
         <w:spacing w:after="60"/>
       </w:pPr>
       <w:r>
-        <w:t xml:space="preserve">Friction 1 : les commerciaux (commissionnés) priorisent les gros leads → des leads payants ne sont jamais recontactés (manque à gagner).</w:t>
+        <w:t xml:space="preserve">Périmètre — 10 fonctions : capter le lead, centraliser (CRM), qualifier, détecter les manquants, calculer le devis, générer le PDF, l’envoyer, relancer, suivre le pipeline, piloter via dashboard.</w:t>
       </w:r>
     </w:p>
     <w:p>
@@ -891,7 +990,7 @@
         <w:spacing w:after="60"/>
       </w:pPr>
       <w:r>
-        <w:t xml:space="preserve">Friction 2 : acquisition bridée — sans automatisation, plus de leads = plus de charge, pas plus de CA.</w:t>
+        <w:t xml:space="preserve">Irritants à résoudre : leads payants jamais recontactés, devis trop lents, relances oubliées, tarif manuel faillible, direction sans visibilité.</w:t>
       </w:r>
     </w:p>
     <w:p>
@@ -904,7 +1003,7 @@
         <w:spacing w:after="60"/>
       </w:pPr>
       <w:r>
-        <w:t xml:space="preserve">Tarification manuelle lente et faillible, relances oubliées, direction sans visibilité.</w:t>
+        <w:t xml:space="preserve">KPIs visés : part des leads traités → ~100 %, délai demande→devis en minutes, taux de conversion, aucune relance oubliée, coût IA/devis maîtrisé (bonus).</w:t>
       </w:r>
     </w:p>
     <w:p>
@@ -924,7 +1023,7 @@
         <w:t xml:space="preserve">À dire : </w:t>
       </w:r>
       <w:r>
-        <w:t xml:space="preserve">Insister : on veut mieux exploiter le flux existant et libérer les commerciaux pour les tâches à forte valeur (conseil, négociation).</w:t>
+        <w:t xml:space="preserve">Poser le cadre : voici ce que le client attendait. On y reviendra (slide 9) pour prouver qu’on répond au besoin.</w:t>
       </w:r>
     </w:p>
     <w:p>
@@ -932,7 +1031,7 @@
         <w:pStyle w:val="Heading1"/>
       </w:pPr>
       <w:r>
-        <w:t xml:space="preserve">Slide 3 — La solution &amp; la règle d’or</w:t>
+        <w:t xml:space="preserve">Slide 3 — Le contexte &amp; le problème</w:t>
       </w:r>
     </w:p>
     <w:p>
@@ -972,7 +1071,7 @@
           <w:iCs/>
           <w:color w:val="666666"/>
         </w:rPr>
-        <w:t xml:space="preserve">Un copilote qui automatise la chaîne sans déshumaniser.</w:t>
+        <w:t xml:space="preserve">NeoTravel reçoit ~60 leads/jour — l’acquisition n’est pas le problème, l’exploitation l’est.</w:t>
       </w:r>
     </w:p>
     <w:p>
@@ -985,7 +1084,7 @@
         <w:spacing w:after="60"/>
       </w:pPr>
       <w:r>
-        <w:t xml:space="preserve">Chaîne complète : captation → qualification (agent IA) → devis déterministe → email/PDF → relances → dashboard.</w:t>
+        <w:t xml:space="preserve">Friction 1 : les commerciaux (commissionnés) priorisent les gros leads → des leads payants ne sont jamais recontactés (manque à gagner).</w:t>
       </w:r>
     </w:p>
     <w:p>
@@ -998,7 +1097,7 @@
         <w:spacing w:after="60"/>
       </w:pPr>
       <w:r>
-        <w:t xml:space="preserve">Règle d’or : l’IA comprend et oriente ; le prix vient TOUJOURS du code déterministe (calculer_devis()), jamais du LLM.</w:t>
+        <w:t xml:space="preserve">Friction 2 : acquisition bridée — sans automatisation, plus de leads = plus de charge, pas plus de CA.</w:t>
       </w:r>
     </w:p>
     <w:p>
@@ -1011,7 +1110,7 @@
         <w:spacing w:after="60"/>
       </w:pPr>
       <w:r>
-        <w:t xml:space="preserve">L’humain garde la main sur les cas sensibles (HITL).</w:t>
+        <w:t xml:space="preserve">S’ajoutent : tarification manuelle lente et faillible, relances oubliées, direction sans visibilité.</w:t>
       </w:r>
     </w:p>
     <w:p>
@@ -1031,7 +1130,7 @@
         <w:t xml:space="preserve">À dire : </w:t>
       </w:r>
       <w:r>
-        <w:t xml:space="preserve">La règle d’or est le fil rouge de toute la soutenance : reproductible, auditable, zéro hallucination tarifaire.</w:t>
+        <w:t xml:space="preserve">Insister : mieux exploiter le flux existant et libérer les commerciaux pour les tâches à forte valeur (conseil, négociation).</w:t>
       </w:r>
     </w:p>
     <w:p>
@@ -1039,7 +1138,7 @@
         <w:pStyle w:val="Heading1"/>
       </w:pPr>
       <w:r>
-        <w:t xml:space="preserve">Slide 4 — Architecture</w:t>
+        <w:t xml:space="preserve">Slide 4 — La solution &amp; la règle d’or</w:t>
       </w:r>
     </w:p>
     <w:p>
@@ -1079,7 +1178,7 @@
           <w:iCs/>
           <w:color w:val="666666"/>
         </w:rPr>
-        <w:t xml:space="preserve">Option A hybride : Next.js (Netlify) + n8n/Gemma + Supabase + Resend.</w:t>
+        <w:t xml:space="preserve">Un copilote qui automatise la chaîne sans déshumaniser.</w:t>
       </w:r>
     </w:p>
     <w:p>
@@ -1092,7 +1191,7 @@
         <w:spacing w:after="60"/>
       </w:pPr>
       <w:r>
-        <w:t xml:space="preserve">Front Next.js = UI + toute la logique métier (routes /api).</w:t>
+        <w:t xml:space="preserve">Chaîne complète : captation → qualification (agent IA) → devis déterministe → email/PDF → relances → dashboard.</w:t>
       </w:r>
     </w:p>
     <w:p>
@@ -1105,7 +1204,7 @@
         <w:spacing w:after="60"/>
       </w:pPr>
       <w:r>
-        <w:t xml:space="preserve">Agent n8n = UN SEUL appel LLM (extraction) ; le nœud Code calcule le prix ET rédige la réponse.</w:t>
+        <w:t xml:space="preserve">Règle d’or : l’IA comprend et oriente ; le prix vient TOUJOURS du code déterministe (calculer_devis()), jamais du LLM.</w:t>
       </w:r>
     </w:p>
     <w:p>
@@ -1118,7 +1217,7 @@
         <w:spacing w:after="60"/>
       </w:pPr>
       <w:r>
-        <w:t xml:space="preserve">Supabase = PostgreSQL + Auth + RLS ; OSRM = distance routière réelle ; Resend = emails.</w:t>
+        <w:t xml:space="preserve">L’humain garde la main sur les cas sensibles (HITL).</w:t>
       </w:r>
     </w:p>
     <w:p>
@@ -1138,7 +1237,7 @@
         <w:t xml:space="preserve">À dire : </w:t>
       </w:r>
       <w:r>
-        <w:t xml:space="preserve">Montrer le schéma de DIAGRAMMES.md. Expliquer pourquoi un seul appel LLM : rapidité, fiabilité, pas de fuite de raisonnement.</w:t>
+        <w:t xml:space="preserve">La règle d’or est le fil rouge de toute la soutenance : reproductible, auditable, zéro hallucination tarifaire.</w:t>
       </w:r>
     </w:p>
     <w:p>
@@ -1146,7 +1245,7 @@
         <w:pStyle w:val="Heading1"/>
       </w:pPr>
       <w:r>
-        <w:t xml:space="preserve">Slide 5 — Démo — parcours prospect (le cœur)</w:t>
+        <w:t xml:space="preserve">Slide 5 — Architecture</w:t>
       </w:r>
     </w:p>
     <w:p>
@@ -1162,7 +1261,7 @@
         <w:t xml:space="preserve">Orateur : </w:t>
       </w:r>
       <w:r>
-        <w:t xml:space="preserve">Zakaria   </w:t>
+        <w:t xml:space="preserve">Axel   </w:t>
       </w:r>
       <w:r>
         <w:rPr>
@@ -1173,7 +1272,7 @@
         <w:t xml:space="preserve">Durée : </w:t>
       </w:r>
       <w:r>
-        <w:t xml:space="preserve">2 min</w:t>
+        <w:t xml:space="preserve">1 min</w:t>
       </w:r>
     </w:p>
     <w:p>
@@ -1186,7 +1285,7 @@
           <w:iCs/>
           <w:color w:val="666666"/>
         </w:rPr>
-        <w:t xml:space="preserve">Chat : « Lyon vers Annecy, 50 personnes, aller-retour le 12 juillet 2026 ».</w:t>
+        <w:t xml:space="preserve">Option A hybride : Next.js (Netlify) + n8n/Gemma + Supabase + Resend.</w:t>
       </w:r>
     </w:p>
     <w:p>
@@ -1199,7 +1298,7 @@
         <w:spacing w:after="60"/>
       </w:pPr>
       <w:r>
-        <w:t xml:space="preserve">La barre « Votre demande » se remplit en direct ; l’agent demande l’email.</w:t>
+        <w:t xml:space="preserve">Front Next.js = UI + toute la logique métier (routes /api).</w:t>
       </w:r>
     </w:p>
     <w:p>
@@ -1212,7 +1311,7 @@
         <w:spacing w:after="60"/>
       </w:pPr>
       <w:r>
-        <w:t xml:space="preserve">Carte devis affichée + email reçu (PDF + boutons Accepter / Refuser).</w:t>
+        <w:t xml:space="preserve">Agent n8n = UN SEUL appel LLM (extraction) ; le nœud Code calcule le prix ET rédige la réponse.</w:t>
       </w:r>
     </w:p>
     <w:p>
@@ -1225,7 +1324,7 @@
         <w:spacing w:after="60"/>
       </w:pPr>
       <w:r>
-        <w:t xml:space="preserve">Phrase clé : le prix vient du moteur, pas de l’IA ; la distance est la vraie distance routière.</w:t>
+        <w:t xml:space="preserve">Supabase = PostgreSQL + Auth + RLS ; OSRM = distance routière réelle ; Resend = emails.</w:t>
       </w:r>
     </w:p>
     <w:p>
@@ -1245,7 +1344,7 @@
         <w:t xml:space="preserve">À dire : </w:t>
       </w:r>
       <w:r>
-        <w:t xml:space="preserve">Si Gemma renvoie un 503 ponctuel, renvoyer le message. Garder le filet : devis de démo déjà en base.</w:t>
+        <w:t xml:space="preserve">Montrer le schéma (docs/architecture.svg / DIAGRAMMES.md). Pourquoi un seul appel LLM : rapidité, fiabilité, pas de fuite de raisonnement.</w:t>
       </w:r>
     </w:p>
     <w:p>
@@ -1253,7 +1352,7 @@
         <w:pStyle w:val="Heading1"/>
       </w:pPr>
       <w:r>
-        <w:t xml:space="preserve">Slide 6 — Démo — cas complexe (HITL)</w:t>
+        <w:t xml:space="preserve">Slide 6 — Choix techniques justifiés</w:t>
       </w:r>
     </w:p>
     <w:p>
@@ -1269,7 +1368,7 @@
         <w:t xml:space="preserve">Orateur : </w:t>
       </w:r>
       <w:r>
-        <w:t xml:space="preserve">Zakaria   </w:t>
+        <w:t xml:space="preserve">Vincent   </w:t>
       </w:r>
       <w:r>
         <w:rPr>
@@ -1280,7 +1379,7 @@
         <w:t xml:space="preserve">Durée : </w:t>
       </w:r>
       <w:r>
-        <w:t xml:space="preserve">1 min</w:t>
+        <w:t xml:space="preserve">2 min</w:t>
       </w:r>
     </w:p>
     <w:p>
@@ -1293,7 +1392,594 @@
           <w:iCs/>
           <w:color w:val="666666"/>
         </w:rPr>
-        <w:t xml:space="preserve">Chat : « Marseille vers Lille, 120 personnes ».</w:t>
+        <w:t xml:space="preserve">Pas seulement ce qu’on a fait, mais pourquoi — avec les critères.</w:t>
+      </w:r>
+    </w:p>
+    <w:tbl>
+      <w:tblPr>
+        <w:tblW w:type="dxa" w:w="9360"/>
+        <w:tblBorders>
+          <w:top w:val="single" w:color="CCCCCC" w:sz="4"/>
+          <w:left w:val="single" w:color="CCCCCC" w:sz="4"/>
+          <w:bottom w:val="single" w:color="CCCCCC" w:sz="4"/>
+          <w:right w:val="single" w:color="CCCCCC" w:sz="4"/>
+          <w:insideH w:val="single" w:color="CCCCCC" w:sz="4"/>
+          <w:insideV w:val="single" w:color="CCCCCC" w:sz="4"/>
+        </w:tblBorders>
+      </w:tblPr>
+      <w:tblGrid>
+        <w:gridCol w:w="1700"/>
+        <w:gridCol w:w="2200"/>
+        <w:gridCol w:w="5460"/>
+      </w:tblGrid>
+      <w:tr>
+        <w:trPr>
+          <w:tblHeader/>
+        </w:trPr>
+        <w:tc>
+          <w:tcPr>
+            <w:tcW w:type="dxa" w:w="1700"/>
+            <w:shd w:fill="D9F0EA" w:val="clear"/>
+            <w:tcMar>
+              <w:top w:type="dxa" w:w="60"/>
+              <w:left w:type="dxa" w:w="110"/>
+              <w:bottom w:type="dxa" w:w="60"/>
+              <w:right w:type="dxa" w:w="110"/>
+            </w:tcMar>
+            <w:vAlign w:val="center"/>
+          </w:tcPr>
+          <w:p>
+            <w:pPr>
+              <w:spacing w:after="0"/>
+              <w:jc w:val="left"/>
+            </w:pPr>
+            <w:r>
+              <w:rPr>
+                <w:b/>
+                <w:bCs/>
+                <w:color w:val="0A5346"/>
+              </w:rPr>
+              <w:t xml:space="preserve">Décision</w:t>
+            </w:r>
+          </w:p>
+        </w:tc>
+        <w:tc>
+          <w:tcPr>
+            <w:tcW w:type="dxa" w:w="2200"/>
+            <w:shd w:fill="D9F0EA" w:val="clear"/>
+            <w:tcMar>
+              <w:top w:type="dxa" w:w="60"/>
+              <w:left w:type="dxa" w:w="110"/>
+              <w:bottom w:type="dxa" w:w="60"/>
+              <w:right w:type="dxa" w:w="110"/>
+            </w:tcMar>
+            <w:vAlign w:val="center"/>
+          </w:tcPr>
+          <w:p>
+            <w:pPr>
+              <w:spacing w:after="0"/>
+              <w:jc w:val="left"/>
+            </w:pPr>
+            <w:r>
+              <w:rPr>
+                <w:b/>
+                <w:bCs/>
+                <w:color w:val="0A5346"/>
+              </w:rPr>
+              <w:t xml:space="preserve">Retenu</w:t>
+            </w:r>
+          </w:p>
+        </w:tc>
+        <w:tc>
+          <w:tcPr>
+            <w:tcW w:type="dxa" w:w="5460"/>
+            <w:shd w:fill="D9F0EA" w:val="clear"/>
+            <w:tcMar>
+              <w:top w:type="dxa" w:w="60"/>
+              <w:left w:type="dxa" w:w="110"/>
+              <w:bottom w:type="dxa" w:w="60"/>
+              <w:right w:type="dxa" w:w="110"/>
+            </w:tcMar>
+            <w:vAlign w:val="center"/>
+          </w:tcPr>
+          <w:p>
+            <w:pPr>
+              <w:spacing w:after="0"/>
+              <w:jc w:val="left"/>
+            </w:pPr>
+            <w:r>
+              <w:rPr>
+                <w:b/>
+                <w:bCs/>
+                <w:color w:val="0A5346"/>
+              </w:rPr>
+              <w:t xml:space="preserve">Critères &amp; pourquoi</w:t>
+            </w:r>
+          </w:p>
+        </w:tc>
+      </w:tr>
+      <w:tr>
+        <w:tc>
+          <w:tcPr>
+            <w:tcW w:type="dxa" w:w="1700"/>
+            <w:shd w:fill="FFFFFF" w:val="clear"/>
+            <w:tcMar>
+              <w:top w:type="dxa" w:w="60"/>
+              <w:left w:type="dxa" w:w="110"/>
+              <w:bottom w:type="dxa" w:w="60"/>
+              <w:right w:type="dxa" w:w="110"/>
+            </w:tcMar>
+            <w:vAlign w:val="center"/>
+          </w:tcPr>
+          <w:p>
+            <w:pPr>
+              <w:spacing w:after="0"/>
+              <w:jc w:val="left"/>
+            </w:pPr>
+            <w:r>
+              <w:rPr>
+                <w:b w:val="false"/>
+                <w:bCs w:val="false"/>
+                <w:color w:val="000000"/>
+              </w:rPr>
+              <w:t xml:space="preserve">Orchestration</w:t>
+            </w:r>
+          </w:p>
+        </w:tc>
+        <w:tc>
+          <w:tcPr>
+            <w:tcW w:type="dxa" w:w="2200"/>
+            <w:shd w:fill="FFFFFF" w:val="clear"/>
+            <w:tcMar>
+              <w:top w:type="dxa" w:w="60"/>
+              <w:left w:type="dxa" w:w="110"/>
+              <w:bottom w:type="dxa" w:w="60"/>
+              <w:right w:type="dxa" w:w="110"/>
+            </w:tcMar>
+            <w:vAlign w:val="center"/>
+          </w:tcPr>
+          <w:p>
+            <w:pPr>
+              <w:spacing w:after="0"/>
+              <w:jc w:val="left"/>
+            </w:pPr>
+            <w:r>
+              <w:rPr>
+                <w:b w:val="false"/>
+                <w:bCs w:val="false"/>
+                <w:color w:val="000000"/>
+              </w:rPr>
+              <w:t xml:space="preserve">n8n (Option A)</w:t>
+            </w:r>
+          </w:p>
+        </w:tc>
+        <w:tc>
+          <w:tcPr>
+            <w:tcW w:type="dxa" w:w="5460"/>
+            <w:shd w:fill="FFFFFF" w:val="clear"/>
+            <w:tcMar>
+              <w:top w:type="dxa" w:w="60"/>
+              <w:left w:type="dxa" w:w="110"/>
+              <w:bottom w:type="dxa" w:w="60"/>
+              <w:right w:type="dxa" w:w="110"/>
+            </w:tcMar>
+            <w:vAlign w:val="center"/>
+          </w:tcPr>
+          <w:p>
+            <w:pPr>
+              <w:spacing w:after="0"/>
+              <w:jc w:val="left"/>
+            </w:pPr>
+            <w:r>
+              <w:rPr>
+                <w:b w:val="false"/>
+                <w:bCs w:val="false"/>
+                <w:color w:val="000000"/>
+              </w:rPr>
+              <w:t xml:space="preserve">Mise en place visuelle et rapide, relances intégrées, courbe d’apprentissage douce — vs Vercel AI SDK.</w:t>
+            </w:r>
+          </w:p>
+        </w:tc>
+      </w:tr>
+      <w:tr>
+        <w:tc>
+          <w:tcPr>
+            <w:tcW w:type="dxa" w:w="1700"/>
+            <w:shd w:fill="F2F8F6" w:val="clear"/>
+            <w:tcMar>
+              <w:top w:type="dxa" w:w="60"/>
+              <w:left w:type="dxa" w:w="110"/>
+              <w:bottom w:type="dxa" w:w="60"/>
+              <w:right w:type="dxa" w:w="110"/>
+            </w:tcMar>
+            <w:vAlign w:val="center"/>
+          </w:tcPr>
+          <w:p>
+            <w:pPr>
+              <w:spacing w:after="0"/>
+              <w:jc w:val="left"/>
+            </w:pPr>
+            <w:r>
+              <w:rPr>
+                <w:b w:val="false"/>
+                <w:bCs w:val="false"/>
+                <w:color w:val="000000"/>
+              </w:rPr>
+              <w:t xml:space="preserve">Modèle IA</w:t>
+            </w:r>
+          </w:p>
+        </w:tc>
+        <w:tc>
+          <w:tcPr>
+            <w:tcW w:type="dxa" w:w="2200"/>
+            <w:shd w:fill="F2F8F6" w:val="clear"/>
+            <w:tcMar>
+              <w:top w:type="dxa" w:w="60"/>
+              <w:left w:type="dxa" w:w="110"/>
+              <w:bottom w:type="dxa" w:w="60"/>
+              <w:right w:type="dxa" w:w="110"/>
+            </w:tcMar>
+            <w:vAlign w:val="center"/>
+          </w:tcPr>
+          <w:p>
+            <w:pPr>
+              <w:spacing w:after="0"/>
+              <w:jc w:val="left"/>
+            </w:pPr>
+            <w:r>
+              <w:rPr>
+                <w:b w:val="false"/>
+                <w:bCs w:val="false"/>
+                <w:color w:val="000000"/>
+              </w:rPr>
+              <w:t xml:space="preserve">Gemma (gemma-4-31b-it)</w:t>
+            </w:r>
+          </w:p>
+        </w:tc>
+        <w:tc>
+          <w:tcPr>
+            <w:tcW w:type="dxa" w:w="5460"/>
+            <w:shd w:fill="F2F8F6" w:val="clear"/>
+            <w:tcMar>
+              <w:top w:type="dxa" w:w="60"/>
+              <w:left w:type="dxa" w:w="110"/>
+              <w:bottom w:type="dxa" w:w="60"/>
+              <w:right w:type="dxa" w:w="110"/>
+            </w:tcMar>
+            <w:vAlign w:val="center"/>
+          </w:tcPr>
+          <w:p>
+            <w:pPr>
+              <w:spacing w:after="0"/>
+              <w:jc w:val="left"/>
+            </w:pPr>
+            <w:r>
+              <w:rPr>
+                <w:b w:val="false"/>
+                <w:bCs w:val="false"/>
+                <w:color w:val="000000"/>
+              </w:rPr>
+              <w:t xml:space="preserve">Coût gratuit (quota AI Studio), sorties JSON structurées fiables, latence basse ; rôle d’assistance seul.</w:t>
+            </w:r>
+          </w:p>
+        </w:tc>
+      </w:tr>
+      <w:tr>
+        <w:tc>
+          <w:tcPr>
+            <w:tcW w:type="dxa" w:w="1700"/>
+            <w:shd w:fill="FFFFFF" w:val="clear"/>
+            <w:tcMar>
+              <w:top w:type="dxa" w:w="60"/>
+              <w:left w:type="dxa" w:w="110"/>
+              <w:bottom w:type="dxa" w:w="60"/>
+              <w:right w:type="dxa" w:w="110"/>
+            </w:tcMar>
+            <w:vAlign w:val="center"/>
+          </w:tcPr>
+          <w:p>
+            <w:pPr>
+              <w:spacing w:after="0"/>
+              <w:jc w:val="left"/>
+            </w:pPr>
+            <w:r>
+              <w:rPr>
+                <w:b w:val="false"/>
+                <w:bCs w:val="false"/>
+                <w:color w:val="000000"/>
+              </w:rPr>
+              <w:t xml:space="preserve">Données &amp; Auth</w:t>
+            </w:r>
+          </w:p>
+        </w:tc>
+        <w:tc>
+          <w:tcPr>
+            <w:tcW w:type="dxa" w:w="2200"/>
+            <w:shd w:fill="FFFFFF" w:val="clear"/>
+            <w:tcMar>
+              <w:top w:type="dxa" w:w="60"/>
+              <w:left w:type="dxa" w:w="110"/>
+              <w:bottom w:type="dxa" w:w="60"/>
+              <w:right w:type="dxa" w:w="110"/>
+            </w:tcMar>
+            <w:vAlign w:val="center"/>
+          </w:tcPr>
+          <w:p>
+            <w:pPr>
+              <w:spacing w:after="0"/>
+              <w:jc w:val="left"/>
+            </w:pPr>
+            <w:r>
+              <w:rPr>
+                <w:b w:val="false"/>
+                <w:bCs w:val="false"/>
+                <w:color w:val="000000"/>
+              </w:rPr>
+              <w:t xml:space="preserve">Supabase (PostgreSQL)</w:t>
+            </w:r>
+          </w:p>
+        </w:tc>
+        <w:tc>
+          <w:tcPr>
+            <w:tcW w:type="dxa" w:w="5460"/>
+            <w:shd w:fill="FFFFFF" w:val="clear"/>
+            <w:tcMar>
+              <w:top w:type="dxa" w:w="60"/>
+              <w:left w:type="dxa" w:w="110"/>
+              <w:bottom w:type="dxa" w:w="60"/>
+              <w:right w:type="dxa" w:w="110"/>
+            </w:tcMar>
+            <w:vAlign w:val="center"/>
+          </w:tcPr>
+          <w:p>
+            <w:pPr>
+              <w:spacing w:after="0"/>
+              <w:jc w:val="left"/>
+            </w:pPr>
+            <w:r>
+              <w:rPr>
+                <w:b w:val="false"/>
+                <w:bCs w:val="false"/>
+                <w:color w:val="000000"/>
+              </w:rPr>
+              <w:t xml:space="preserve">Base + Auth + RLS dans une seule stack → dashboard custom sans surcoût, sécurité par ligne — vs Airtable.</w:t>
+            </w:r>
+          </w:p>
+        </w:tc>
+      </w:tr>
+      <w:tr>
+        <w:tc>
+          <w:tcPr>
+            <w:tcW w:type="dxa" w:w="1700"/>
+            <w:shd w:fill="F2F8F6" w:val="clear"/>
+            <w:tcMar>
+              <w:top w:type="dxa" w:w="60"/>
+              <w:left w:type="dxa" w:w="110"/>
+              <w:bottom w:type="dxa" w:w="60"/>
+              <w:right w:type="dxa" w:w="110"/>
+            </w:tcMar>
+            <w:vAlign w:val="center"/>
+          </w:tcPr>
+          <w:p>
+            <w:pPr>
+              <w:spacing w:after="0"/>
+              <w:jc w:val="left"/>
+            </w:pPr>
+            <w:r>
+              <w:rPr>
+                <w:b w:val="false"/>
+                <w:bCs w:val="false"/>
+                <w:color w:val="000000"/>
+              </w:rPr>
+              <w:t xml:space="preserve">Appels LLM</w:t>
+            </w:r>
+          </w:p>
+        </w:tc>
+        <w:tc>
+          <w:tcPr>
+            <w:tcW w:type="dxa" w:w="2200"/>
+            <w:shd w:fill="F2F8F6" w:val="clear"/>
+            <w:tcMar>
+              <w:top w:type="dxa" w:w="60"/>
+              <w:left w:type="dxa" w:w="110"/>
+              <w:bottom w:type="dxa" w:w="60"/>
+              <w:right w:type="dxa" w:w="110"/>
+            </w:tcMar>
+            <w:vAlign w:val="center"/>
+          </w:tcPr>
+          <w:p>
+            <w:pPr>
+              <w:spacing w:after="0"/>
+              <w:jc w:val="left"/>
+            </w:pPr>
+            <w:r>
+              <w:rPr>
+                <w:b w:val="false"/>
+                <w:bCs w:val="false"/>
+                <w:color w:val="000000"/>
+              </w:rPr>
+              <w:t xml:space="preserve">Un seul (extraction)</w:t>
+            </w:r>
+          </w:p>
+        </w:tc>
+        <w:tc>
+          <w:tcPr>
+            <w:tcW w:type="dxa" w:w="5460"/>
+            <w:shd w:fill="F2F8F6" w:val="clear"/>
+            <w:tcMar>
+              <w:top w:type="dxa" w:w="60"/>
+              <w:left w:type="dxa" w:w="110"/>
+              <w:bottom w:type="dxa" w:w="60"/>
+              <w:right w:type="dxa" w:w="110"/>
+            </w:tcMar>
+            <w:vAlign w:val="center"/>
+          </w:tcPr>
+          <w:p>
+            <w:pPr>
+              <w:spacing w:after="0"/>
+              <w:jc w:val="left"/>
+            </w:pPr>
+            <w:r>
+              <w:rPr>
+                <w:b w:val="false"/>
+                <w:bCs w:val="false"/>
+                <w:color w:val="000000"/>
+              </w:rPr>
+              <w:t xml:space="preserve">Tient dans le timeout 30 s, moins d’erreurs 503, aucune fuite de raisonnement vers le client.</w:t>
+            </w:r>
+          </w:p>
+        </w:tc>
+      </w:tr>
+      <w:tr>
+        <w:tc>
+          <w:tcPr>
+            <w:tcW w:type="dxa" w:w="1700"/>
+            <w:shd w:fill="FFFFFF" w:val="clear"/>
+            <w:tcMar>
+              <w:top w:type="dxa" w:w="60"/>
+              <w:left w:type="dxa" w:w="110"/>
+              <w:bottom w:type="dxa" w:w="60"/>
+              <w:right w:type="dxa" w:w="110"/>
+            </w:tcMar>
+            <w:vAlign w:val="center"/>
+          </w:tcPr>
+          <w:p>
+            <w:pPr>
+              <w:spacing w:after="0"/>
+              <w:jc w:val="left"/>
+            </w:pPr>
+            <w:r>
+              <w:rPr>
+                <w:b w:val="false"/>
+                <w:bCs w:val="false"/>
+                <w:color w:val="000000"/>
+              </w:rPr>
+              <w:t xml:space="preserve">Limite observée</w:t>
+            </w:r>
+          </w:p>
+        </w:tc>
+        <w:tc>
+          <w:tcPr>
+            <w:tcW w:type="dxa" w:w="2200"/>
+            <w:shd w:fill="FFFFFF" w:val="clear"/>
+            <w:tcMar>
+              <w:top w:type="dxa" w:w="60"/>
+              <w:left w:type="dxa" w:w="110"/>
+              <w:bottom w:type="dxa" w:w="60"/>
+              <w:right w:type="dxa" w:w="110"/>
+            </w:tcMar>
+            <w:vAlign w:val="center"/>
+          </w:tcPr>
+          <w:p>
+            <w:pPr>
+              <w:spacing w:after="0"/>
+              <w:jc w:val="left"/>
+            </w:pPr>
+            <w:r>
+              <w:rPr>
+                <w:b w:val="false"/>
+                <w:bCs w:val="false"/>
+                <w:color w:val="000000"/>
+              </w:rPr>
+              <w:t xml:space="preserve">503 ponctuels du LLM</w:t>
+            </w:r>
+          </w:p>
+        </w:tc>
+        <w:tc>
+          <w:tcPr>
+            <w:tcW w:type="dxa" w:w="5460"/>
+            <w:shd w:fill="FFFFFF" w:val="clear"/>
+            <w:tcMar>
+              <w:top w:type="dxa" w:w="60"/>
+              <w:left w:type="dxa" w:w="110"/>
+              <w:bottom w:type="dxa" w:w="60"/>
+              <w:right w:type="dxa" w:w="110"/>
+            </w:tcMar>
+            <w:vAlign w:val="center"/>
+          </w:tcPr>
+          <w:p>
+            <w:pPr>
+              <w:spacing w:after="0"/>
+              <w:jc w:val="left"/>
+            </w:pPr>
+            <w:r>
+              <w:rPr>
+                <w:b w:val="false"/>
+                <w:bCs w:val="false"/>
+                <w:color w:val="000000"/>
+              </w:rPr>
+              <w:t xml:space="preserve">Mitigée : retries + prix et réponse indépendants du LLM → le devis sort même si le modèle hésite.</w:t>
+            </w:r>
+          </w:p>
+        </w:tc>
+      </w:tr>
+    </w:tbl>
+    <w:p>
+      <w:pPr>
+        <w:pBdr>
+          <w:left w:val="single" w:color="0E7A66" w:sz="18" w:space="8"/>
+        </w:pBdr>
+        <w:shd w:fill="F2F8F6" w:val="clear"/>
+        <w:spacing w:after="160" w:before="80"/>
+      </w:pPr>
+      <w:r>
+        <w:rPr>
+          <w:b/>
+          <w:bCs/>
+          <w:color w:val="0A5346"/>
+        </w:rPr>
+        <w:t xml:space="preserve">À dire : </w:t>
+      </w:r>
+      <w:r>
+        <w:t xml:space="preserve">Défendre chaque décision par ses critères (coût, qualité, latence, sorties structurées, compatibilité stack) et assumer la limite. Renvoyer à l’« Argumentaire des choix » (L1).</w:t>
+      </w:r>
+    </w:p>
+    <w:p>
+      <w:pPr>
+        <w:pStyle w:val="Heading1"/>
+      </w:pPr>
+      <w:r>
+        <w:t xml:space="preserve">Slide 7 — Fiabilité &amp; garde-fous</w:t>
+      </w:r>
+    </w:p>
+    <w:p>
+      <w:pPr>
+        <w:spacing w:after="120"/>
+      </w:pPr>
+      <w:r>
+        <w:rPr>
+          <w:b/>
+          <w:bCs/>
+          <w:color w:val="0A5346"/>
+        </w:rPr>
+        <w:t xml:space="preserve">Orateur : </w:t>
+      </w:r>
+      <w:r>
+        <w:t xml:space="preserve">Vincent   </w:t>
+      </w:r>
+      <w:r>
+        <w:rPr>
+          <w:b/>
+          <w:bCs/>
+          <w:color w:val="0A5346"/>
+        </w:rPr>
+        <w:t xml:space="preserve">Durée : </w:t>
+      </w:r>
+      <w:r>
+        <w:t xml:space="preserve">1 min</w:t>
+      </w:r>
+    </w:p>
+    <w:p>
+      <w:pPr>
+        <w:spacing w:after="120"/>
+      </w:pPr>
+      <w:r>
+        <w:rPr>
+          <w:i/>
+          <w:iCs/>
+          <w:color w:val="666666"/>
+        </w:rPr>
+        <w:t xml:space="preserve">Un système sûr, juste et auditable.</w:t>
       </w:r>
     </w:p>
     <w:p>
@@ -1306,7 +1992,7 @@
         <w:spacing w:after="60"/>
       </w:pPr>
       <w:r>
-        <w:t xml:space="preserve">Au-delà de 85 passagers → message d’escalade, pas de devis automatique.</w:t>
+        <w:t xml:space="preserve">Prix 100 % déterministe (calculer_devis() testé) ; 1ᵉʳ prix figé (distance réelle OSRM).</w:t>
       </w:r>
     </w:p>
     <w:p>
@@ -1319,75 +2005,7 @@
         <w:spacing w:after="60"/>
       </w:pPr>
       <w:r>
-        <w:t xml:space="preserve">La demande devient un cas complexe transmis à un humain avec le contexte.</w:t>
-      </w:r>
-    </w:p>
-    <w:p>
-      <w:pPr>
-        <w:pBdr>
-          <w:left w:val="single" w:color="0E7A66" w:sz="18" w:space="8"/>
-        </w:pBdr>
-        <w:shd w:fill="F2F8F6" w:val="clear"/>
-        <w:spacing w:after="160" w:before="80"/>
-      </w:pPr>
-      <w:r>
-        <w:rPr>
-          <w:b/>
-          <w:bCs/>
-          <w:color w:val="0A5346"/>
-        </w:rPr>
-        <w:t xml:space="preserve">À dire : </w:t>
-      </w:r>
-      <w:r>
-        <w:t xml:space="preserve">Montrer que le système sait dire « non » à l’automatisation totale : c’est un gage de fiabilité, pas une limite.</w:t>
-      </w:r>
-    </w:p>
-    <w:p>
-      <w:pPr>
-        <w:pStyle w:val="Heading1"/>
-      </w:pPr>
-      <w:r>
-        <w:t xml:space="preserve">Slide 7 — Démo — côté client</w:t>
-      </w:r>
-    </w:p>
-    <w:p>
-      <w:pPr>
-        <w:spacing w:after="120"/>
-      </w:pPr>
-      <w:r>
-        <w:rPr>
-          <w:b/>
-          <w:bCs/>
-          <w:color w:val="0A5346"/>
-        </w:rPr>
-        <w:t xml:space="preserve">Orateur : </w:t>
-      </w:r>
-      <w:r>
-        <w:t xml:space="preserve">Zakaria   </w:t>
-      </w:r>
-      <w:r>
-        <w:rPr>
-          <w:b/>
-          <w:bCs/>
-          <w:color w:val="0A5346"/>
-        </w:rPr>
-        <w:t xml:space="preserve">Durée : </w:t>
-      </w:r>
-      <w:r>
-        <w:t xml:space="preserve">1,5 min</w:t>
-      </w:r>
-    </w:p>
-    <w:p>
-      <w:pPr>
-        <w:spacing w:after="120"/>
-      </w:pPr>
-      <w:r>
-        <w:rPr>
-          <w:i/>
-          <w:iCs/>
-          <w:color w:val="666666"/>
-        </w:rPr>
-        <w:t xml:space="preserve">De l’email à l’espace client.</w:t>
+        <w:t xml:space="preserve">Jeu de tests : cas types ET cas limites (0 passager, date incohérente, gros volume, &gt; 85 pax → escalade).</w:t>
       </w:r>
     </w:p>
     <w:p>
@@ -1400,7 +2018,1187 @@
         <w:spacing w:after="60"/>
       </w:pPr>
       <w:r>
-        <w:t xml:space="preserve">Bouton « Accepter » d’un email sans compte → inscription pré-remplie.</w:t>
+        <w:t xml:space="preserve">RGPD (minimisation, domaine de démo sans envoi réel) ; prompt injection (le code ne négocie jamais le prix) ; HITL.</w:t>
+      </w:r>
+    </w:p>
+    <w:p>
+      <w:pPr>
+        <w:pBdr>
+          <w:left w:val="single" w:color="0E7A66" w:sz="18" w:space="8"/>
+        </w:pBdr>
+        <w:shd w:fill="F2F8F6" w:val="clear"/>
+        <w:spacing w:after="160" w:before="80"/>
+      </w:pPr>
+      <w:r>
+        <w:rPr>
+          <w:b/>
+          <w:bCs/>
+          <w:color w:val="0A5346"/>
+        </w:rPr>
+        <w:t xml:space="preserve">À dire : </w:t>
+      </w:r>
+      <w:r>
+        <w:t xml:space="preserve">Montrer rapidement npm test qui passe, et /docs (Swagger) : « toute l’API est documentée et explorable ».</w:t>
+      </w:r>
+    </w:p>
+    <w:p>
+      <w:pPr>
+        <w:pStyle w:val="Heading1"/>
+      </w:pPr>
+      <w:r>
+        <w:t xml:space="preserve">Slide 8 — Prévu (L1) vs réalisé (L2/L3)</w:t>
+      </w:r>
+    </w:p>
+    <w:p>
+      <w:pPr>
+        <w:spacing w:after="120"/>
+      </w:pPr>
+      <w:r>
+        <w:rPr>
+          <w:b/>
+          <w:bCs/>
+          <w:color w:val="0A5346"/>
+        </w:rPr>
+        <w:t xml:space="preserve">Orateur : </w:t>
+      </w:r>
+      <w:r>
+        <w:t xml:space="preserve">Vincent   </w:t>
+      </w:r>
+      <w:r>
+        <w:rPr>
+          <w:b/>
+          <w:bCs/>
+          <w:color w:val="0A5346"/>
+        </w:rPr>
+        <w:t xml:space="preserve">Durée : </w:t>
+      </w:r>
+      <w:r>
+        <w:t xml:space="preserve">1,5 min</w:t>
+      </w:r>
+    </w:p>
+    <w:p>
+      <w:pPr>
+        <w:spacing w:after="120"/>
+      </w:pPr>
+      <w:r>
+        <w:rPr>
+          <w:i/>
+          <w:iCs/>
+          <w:color w:val="666666"/>
+        </w:rPr>
+        <w:t xml:space="preserve">Transparence sur les écarts entre le cadrage et la réalisation.</w:t>
+      </w:r>
+    </w:p>
+    <w:tbl>
+      <w:tblPr>
+        <w:tblW w:type="dxa" w:w="9360"/>
+        <w:tblBorders>
+          <w:top w:val="single" w:color="CCCCCC" w:sz="4"/>
+          <w:left w:val="single" w:color="CCCCCC" w:sz="4"/>
+          <w:bottom w:val="single" w:color="CCCCCC" w:sz="4"/>
+          <w:right w:val="single" w:color="CCCCCC" w:sz="4"/>
+          <w:insideH w:val="single" w:color="CCCCCC" w:sz="4"/>
+          <w:insideV w:val="single" w:color="CCCCCC" w:sz="4"/>
+        </w:tblBorders>
+      </w:tblPr>
+      <w:tblGrid>
+        <w:gridCol w:w="2500"/>
+        <w:gridCol w:w="2900"/>
+        <w:gridCol w:w="3960"/>
+      </w:tblGrid>
+      <w:tr>
+        <w:trPr>
+          <w:tblHeader/>
+        </w:trPr>
+        <w:tc>
+          <w:tcPr>
+            <w:tcW w:type="dxa" w:w="2500"/>
+            <w:shd w:fill="D9F0EA" w:val="clear"/>
+            <w:tcMar>
+              <w:top w:type="dxa" w:w="60"/>
+              <w:left w:type="dxa" w:w="110"/>
+              <w:bottom w:type="dxa" w:w="60"/>
+              <w:right w:type="dxa" w:w="110"/>
+            </w:tcMar>
+            <w:vAlign w:val="center"/>
+          </w:tcPr>
+          <w:p>
+            <w:pPr>
+              <w:spacing w:after="0"/>
+              <w:jc w:val="left"/>
+            </w:pPr>
+            <w:r>
+              <w:rPr>
+                <w:b/>
+                <w:bCs/>
+                <w:color w:val="0A5346"/>
+              </w:rPr>
+              <w:t xml:space="preserve">Prévu — cadrage L1</w:t>
+            </w:r>
+          </w:p>
+        </w:tc>
+        <w:tc>
+          <w:tcPr>
+            <w:tcW w:type="dxa" w:w="2900"/>
+            <w:shd w:fill="D9F0EA" w:val="clear"/>
+            <w:tcMar>
+              <w:top w:type="dxa" w:w="60"/>
+              <w:left w:type="dxa" w:w="110"/>
+              <w:bottom w:type="dxa" w:w="60"/>
+              <w:right w:type="dxa" w:w="110"/>
+            </w:tcMar>
+            <w:vAlign w:val="center"/>
+          </w:tcPr>
+          <w:p>
+            <w:pPr>
+              <w:spacing w:after="0"/>
+              <w:jc w:val="left"/>
+            </w:pPr>
+            <w:r>
+              <w:rPr>
+                <w:b/>
+                <w:bCs/>
+                <w:color w:val="0A5346"/>
+              </w:rPr>
+              <w:t xml:space="preserve">Réalisé</w:t>
+            </w:r>
+          </w:p>
+        </w:tc>
+        <w:tc>
+          <w:tcPr>
+            <w:tcW w:type="dxa" w:w="3960"/>
+            <w:shd w:fill="D9F0EA" w:val="clear"/>
+            <w:tcMar>
+              <w:top w:type="dxa" w:w="60"/>
+              <w:left w:type="dxa" w:w="110"/>
+              <w:bottom w:type="dxa" w:w="60"/>
+              <w:right w:type="dxa" w:w="110"/>
+            </w:tcMar>
+            <w:vAlign w:val="center"/>
+          </w:tcPr>
+          <w:p>
+            <w:pPr>
+              <w:spacing w:after="0"/>
+              <w:jc w:val="left"/>
+            </w:pPr>
+            <w:r>
+              <w:rPr>
+                <w:b/>
+                <w:bCs/>
+                <w:color w:val="0A5346"/>
+              </w:rPr>
+              <w:t xml:space="preserve">Raison de l’écart</w:t>
+            </w:r>
+          </w:p>
+        </w:tc>
+      </w:tr>
+      <w:tr>
+        <w:tc>
+          <w:tcPr>
+            <w:tcW w:type="dxa" w:w="2500"/>
+            <w:shd w:fill="FFFFFF" w:val="clear"/>
+            <w:tcMar>
+              <w:top w:type="dxa" w:w="60"/>
+              <w:left w:type="dxa" w:w="110"/>
+              <w:bottom w:type="dxa" w:w="60"/>
+              <w:right w:type="dxa" w:w="110"/>
+            </w:tcMar>
+            <w:vAlign w:val="center"/>
+          </w:tcPr>
+          <w:p>
+            <w:pPr>
+              <w:spacing w:after="0"/>
+              <w:jc w:val="left"/>
+            </w:pPr>
+            <w:r>
+              <w:rPr>
+                <w:b w:val="false"/>
+                <w:bCs w:val="false"/>
+                <w:color w:val="000000"/>
+              </w:rPr>
+              <w:t xml:space="preserve">Modèle gpt-4o-mini</w:t>
+            </w:r>
+          </w:p>
+        </w:tc>
+        <w:tc>
+          <w:tcPr>
+            <w:tcW w:type="dxa" w:w="2900"/>
+            <w:shd w:fill="FFFFFF" w:val="clear"/>
+            <w:tcMar>
+              <w:top w:type="dxa" w:w="60"/>
+              <w:left w:type="dxa" w:w="110"/>
+              <w:bottom w:type="dxa" w:w="60"/>
+              <w:right w:type="dxa" w:w="110"/>
+            </w:tcMar>
+            <w:vAlign w:val="center"/>
+          </w:tcPr>
+          <w:p>
+            <w:pPr>
+              <w:spacing w:after="0"/>
+              <w:jc w:val="left"/>
+            </w:pPr>
+            <w:r>
+              <w:rPr>
+                <w:b w:val="false"/>
+                <w:bCs w:val="false"/>
+                <w:color w:val="000000"/>
+              </w:rPr>
+              <w:t xml:space="preserve">Gemma (gratuit)</w:t>
+            </w:r>
+          </w:p>
+        </w:tc>
+        <w:tc>
+          <w:tcPr>
+            <w:tcW w:type="dxa" w:w="3960"/>
+            <w:shd w:fill="FFFFFF" w:val="clear"/>
+            <w:tcMar>
+              <w:top w:type="dxa" w:w="60"/>
+              <w:left w:type="dxa" w:w="110"/>
+              <w:bottom w:type="dxa" w:w="60"/>
+              <w:right w:type="dxa" w:w="110"/>
+            </w:tcMar>
+            <w:vAlign w:val="center"/>
+          </w:tcPr>
+          <w:p>
+            <w:pPr>
+              <w:spacing w:after="0"/>
+              <w:jc w:val="left"/>
+            </w:pPr>
+            <w:r>
+              <w:rPr>
+                <w:b w:val="false"/>
+                <w:bCs w:val="false"/>
+                <w:color w:val="000000"/>
+              </w:rPr>
+              <w:t xml:space="preserve">Quota AI Studio, sorties JSON suffisantes ; le LLM ne fait qu’extraire.</w:t>
+            </w:r>
+          </w:p>
+        </w:tc>
+      </w:tr>
+      <w:tr>
+        <w:tc>
+          <w:tcPr>
+            <w:tcW w:type="dxa" w:w="2500"/>
+            <w:shd w:fill="F2F8F6" w:val="clear"/>
+            <w:tcMar>
+              <w:top w:type="dxa" w:w="60"/>
+              <w:left w:type="dxa" w:w="110"/>
+              <w:bottom w:type="dxa" w:w="60"/>
+              <w:right w:type="dxa" w:w="110"/>
+            </w:tcMar>
+            <w:vAlign w:val="center"/>
+          </w:tcPr>
+          <w:p>
+            <w:pPr>
+              <w:spacing w:after="0"/>
+              <w:jc w:val="left"/>
+            </w:pPr>
+            <w:r>
+              <w:rPr>
+                <w:b w:val="false"/>
+                <w:bCs w:val="false"/>
+                <w:color w:val="000000"/>
+              </w:rPr>
+              <w:t xml:space="preserve">Distance estimée (API en P2)</w:t>
+            </w:r>
+          </w:p>
+        </w:tc>
+        <w:tc>
+          <w:tcPr>
+            <w:tcW w:type="dxa" w:w="2900"/>
+            <w:shd w:fill="F2F8F6" w:val="clear"/>
+            <w:tcMar>
+              <w:top w:type="dxa" w:w="60"/>
+              <w:left w:type="dxa" w:w="110"/>
+              <w:bottom w:type="dxa" w:w="60"/>
+              <w:right w:type="dxa" w:w="110"/>
+            </w:tcMar>
+            <w:vAlign w:val="center"/>
+          </w:tcPr>
+          <w:p>
+            <w:pPr>
+              <w:spacing w:after="0"/>
+              <w:jc w:val="left"/>
+            </w:pPr>
+            <w:r>
+              <w:rPr>
+                <w:b w:val="false"/>
+                <w:bCs w:val="false"/>
+                <w:color w:val="000000"/>
+              </w:rPr>
+              <w:t xml:space="preserve">Distance routière réelle (OSRM) dès le MVP</w:t>
+            </w:r>
+          </w:p>
+        </w:tc>
+        <w:tc>
+          <w:tcPr>
+            <w:tcW w:type="dxa" w:w="3960"/>
+            <w:shd w:fill="F2F8F6" w:val="clear"/>
+            <w:tcMar>
+              <w:top w:type="dxa" w:w="60"/>
+              <w:left w:type="dxa" w:w="110"/>
+              <w:bottom w:type="dxa" w:w="60"/>
+              <w:right w:type="dxa" w:w="110"/>
+            </w:tcMar>
+            <w:vAlign w:val="center"/>
+          </w:tcPr>
+          <w:p>
+            <w:pPr>
+              <w:spacing w:after="0"/>
+              <w:jc w:val="left"/>
+            </w:pPr>
+            <w:r>
+              <w:rPr>
+                <w:b w:val="false"/>
+                <w:bCs w:val="false"/>
+                <w:color w:val="000000"/>
+              </w:rPr>
+              <w:t xml:space="preserve">Service gratuit, sans clé → devis plus juste tout de suite.</w:t>
+            </w:r>
+          </w:p>
+        </w:tc>
+      </w:tr>
+      <w:tr>
+        <w:tc>
+          <w:tcPr>
+            <w:tcW w:type="dxa" w:w="2500"/>
+            <w:shd w:fill="FFFFFF" w:val="clear"/>
+            <w:tcMar>
+              <w:top w:type="dxa" w:w="60"/>
+              <w:left w:type="dxa" w:w="110"/>
+              <w:bottom w:type="dxa" w:w="60"/>
+              <w:right w:type="dxa" w:w="110"/>
+            </w:tcMar>
+            <w:vAlign w:val="center"/>
+          </w:tcPr>
+          <w:p>
+            <w:pPr>
+              <w:spacing w:after="0"/>
+              <w:jc w:val="left"/>
+            </w:pPr>
+            <w:r>
+              <w:rPr>
+                <w:b w:val="false"/>
+                <w:bCs w:val="false"/>
+                <w:color w:val="000000"/>
+              </w:rPr>
+              <w:t xml:space="preserve">n8n hébergé (cloud)</w:t>
+            </w:r>
+          </w:p>
+        </w:tc>
+        <w:tc>
+          <w:tcPr>
+            <w:tcW w:type="dxa" w:w="2900"/>
+            <w:shd w:fill="FFFFFF" w:val="clear"/>
+            <w:tcMar>
+              <w:top w:type="dxa" w:w="60"/>
+              <w:left w:type="dxa" w:w="110"/>
+              <w:bottom w:type="dxa" w:w="60"/>
+              <w:right w:type="dxa" w:w="110"/>
+            </w:tcMar>
+            <w:vAlign w:val="center"/>
+          </w:tcPr>
+          <w:p>
+            <w:pPr>
+              <w:spacing w:after="0"/>
+              <w:jc w:val="left"/>
+            </w:pPr>
+            <w:r>
+              <w:rPr>
+                <w:b w:val="false"/>
+                <w:bCs w:val="false"/>
+                <w:color w:val="000000"/>
+              </w:rPr>
+              <w:t xml:space="preserve">Tunnel local à URL fixe (0 €)</w:t>
+            </w:r>
+          </w:p>
+        </w:tc>
+        <w:tc>
+          <w:tcPr>
+            <w:tcW w:type="dxa" w:w="3960"/>
+            <w:shd w:fill="FFFFFF" w:val="clear"/>
+            <w:tcMar>
+              <w:top w:type="dxa" w:w="60"/>
+              <w:left w:type="dxa" w:w="110"/>
+              <w:bottom w:type="dxa" w:w="60"/>
+              <w:right w:type="dxa" w:w="110"/>
+            </w:tcMar>
+            <w:vAlign w:val="center"/>
+          </w:tcPr>
+          <w:p>
+            <w:pPr>
+              <w:spacing w:after="0"/>
+              <w:jc w:val="left"/>
+            </w:pPr>
+            <w:r>
+              <w:rPr>
+                <w:b w:val="false"/>
+                <w:bCs w:val="false"/>
+                <w:color w:val="000000"/>
+              </w:rPr>
+              <w:t xml:space="preserve">MVP gratuit et suffisant pour la démo ; voie de prod documentée.</w:t>
+            </w:r>
+          </w:p>
+        </w:tc>
+      </w:tr>
+      <w:tr>
+        <w:tc>
+          <w:tcPr>
+            <w:tcW w:type="dxa" w:w="2500"/>
+            <w:shd w:fill="F2F8F6" w:val="clear"/>
+            <w:tcMar>
+              <w:top w:type="dxa" w:w="60"/>
+              <w:left w:type="dxa" w:w="110"/>
+              <w:bottom w:type="dxa" w:w="60"/>
+              <w:right w:type="dxa" w:w="110"/>
+            </w:tcMar>
+            <w:vAlign w:val="center"/>
+          </w:tcPr>
+          <w:p>
+            <w:pPr>
+              <w:spacing w:after="0"/>
+              <w:jc w:val="left"/>
+            </w:pPr>
+            <w:r>
+              <w:rPr>
+                <w:b w:val="false"/>
+                <w:bCs w:val="false"/>
+                <w:color w:val="000000"/>
+              </w:rPr>
+              <w:t xml:space="preserve">Espace client = bonus</w:t>
+            </w:r>
+          </w:p>
+        </w:tc>
+        <w:tc>
+          <w:tcPr>
+            <w:tcW w:type="dxa" w:w="2900"/>
+            <w:shd w:fill="F2F8F6" w:val="clear"/>
+            <w:tcMar>
+              <w:top w:type="dxa" w:w="60"/>
+              <w:left w:type="dxa" w:w="110"/>
+              <w:bottom w:type="dxa" w:w="60"/>
+              <w:right w:type="dxa" w:w="110"/>
+            </w:tcMar>
+            <w:vAlign w:val="center"/>
+          </w:tcPr>
+          <w:p>
+            <w:pPr>
+              <w:spacing w:after="0"/>
+              <w:jc w:val="left"/>
+            </w:pPr>
+            <w:r>
+              <w:rPr>
+                <w:b w:val="false"/>
+                <w:bCs w:val="false"/>
+                <w:color w:val="000000"/>
+              </w:rPr>
+              <w:t xml:space="preserve">Livré : suivi devis + conversations + messagerie HITL</w:t>
+            </w:r>
+          </w:p>
+        </w:tc>
+        <w:tc>
+          <w:tcPr>
+            <w:tcW w:type="dxa" w:w="3960"/>
+            <w:shd w:fill="F2F8F6" w:val="clear"/>
+            <w:tcMar>
+              <w:top w:type="dxa" w:w="60"/>
+              <w:left w:type="dxa" w:w="110"/>
+              <w:bottom w:type="dxa" w:w="60"/>
+              <w:right w:type="dxa" w:w="110"/>
+            </w:tcMar>
+            <w:vAlign w:val="center"/>
+          </w:tcPr>
+          <w:p>
+            <w:pPr>
+              <w:spacing w:after="0"/>
+              <w:jc w:val="left"/>
+            </w:pPr>
+            <w:r>
+              <w:rPr>
+                <w:b w:val="false"/>
+                <w:bCs w:val="false"/>
+                <w:color w:val="000000"/>
+              </w:rPr>
+              <w:t xml:space="preserve">Forte valeur client, faisable simplement dans Supabase.</w:t>
+            </w:r>
+          </w:p>
+        </w:tc>
+      </w:tr>
+      <w:tr>
+        <w:tc>
+          <w:tcPr>
+            <w:tcW w:type="dxa" w:w="2500"/>
+            <w:shd w:fill="FFFFFF" w:val="clear"/>
+            <w:tcMar>
+              <w:top w:type="dxa" w:w="60"/>
+              <w:left w:type="dxa" w:w="110"/>
+              <w:bottom w:type="dxa" w:w="60"/>
+              <w:right w:type="dxa" w:w="110"/>
+            </w:tcMar>
+            <w:vAlign w:val="center"/>
+          </w:tcPr>
+          <w:p>
+            <w:pPr>
+              <w:spacing w:after="0"/>
+              <w:jc w:val="left"/>
+            </w:pPr>
+            <w:r>
+              <w:rPr>
+                <w:b w:val="false"/>
+                <w:bCs w:val="false"/>
+                <w:color w:val="000000"/>
+              </w:rPr>
+              <w:t xml:space="preserve">Dashboard simple</w:t>
+            </w:r>
+          </w:p>
+        </w:tc>
+        <w:tc>
+          <w:tcPr>
+            <w:tcW w:type="dxa" w:w="2900"/>
+            <w:shd w:fill="FFFFFF" w:val="clear"/>
+            <w:tcMar>
+              <w:top w:type="dxa" w:w="60"/>
+              <w:left w:type="dxa" w:w="110"/>
+              <w:bottom w:type="dxa" w:w="60"/>
+              <w:right w:type="dxa" w:w="110"/>
+            </w:tcMar>
+            <w:vAlign w:val="center"/>
+          </w:tcPr>
+          <w:p>
+            <w:pPr>
+              <w:spacing w:after="0"/>
+              <w:jc w:val="left"/>
+            </w:pPr>
+            <w:r>
+              <w:rPr>
+                <w:b w:val="false"/>
+                <w:bCs w:val="false"/>
+                <w:color w:val="000000"/>
+              </w:rPr>
+              <w:t xml:space="preserve">Dashboard riche : courbe, camembert, export PDF</w:t>
+            </w:r>
+          </w:p>
+        </w:tc>
+        <w:tc>
+          <w:tcPr>
+            <w:tcW w:type="dxa" w:w="3960"/>
+            <w:shd w:fill="FFFFFF" w:val="clear"/>
+            <w:tcMar>
+              <w:top w:type="dxa" w:w="60"/>
+              <w:left w:type="dxa" w:w="110"/>
+              <w:bottom w:type="dxa" w:w="60"/>
+              <w:right w:type="dxa" w:w="110"/>
+            </w:tcMar>
+            <w:vAlign w:val="center"/>
+          </w:tcPr>
+          <w:p>
+            <w:pPr>
+              <w:spacing w:after="0"/>
+              <w:jc w:val="left"/>
+            </w:pPr>
+            <w:r>
+              <w:rPr>
+                <w:b w:val="false"/>
+                <w:bCs w:val="false"/>
+                <w:color w:val="000000"/>
+              </w:rPr>
+              <w:t xml:space="preserve">Supabase facilitait un vrai pilotage par la donnée.</w:t>
+            </w:r>
+          </w:p>
+        </w:tc>
+      </w:tr>
+    </w:tbl>
+    <w:p>
+      <w:pPr>
+        <w:pBdr>
+          <w:left w:val="single" w:color="0E7A66" w:sz="18" w:space="8"/>
+        </w:pBdr>
+        <w:shd w:fill="F2F8F6" w:val="clear"/>
+        <w:spacing w:after="160" w:before="80"/>
+      </w:pPr>
+      <w:r>
+        <w:rPr>
+          <w:b/>
+          <w:bCs/>
+          <w:color w:val="0A5346"/>
+        </w:rPr>
+        <w:t xml:space="preserve">À dire : </w:t>
+      </w:r>
+      <w:r>
+        <w:t xml:space="preserve">Assumer les écarts comme des décisions, pas des oublis. On a tenu le cap (chaîne complète) et certains arbitrages ont amélioré le résultat.</w:t>
+      </w:r>
+    </w:p>
+    <w:p>
+      <w:pPr>
+        <w:pStyle w:val="Heading1"/>
+      </w:pPr>
+      <w:r>
+        <w:t xml:space="preserve">Slide 9 — Attentes du client → réponses livrées</w:t>
+      </w:r>
+    </w:p>
+    <w:p>
+      <w:pPr>
+        <w:spacing w:after="120"/>
+      </w:pPr>
+      <w:r>
+        <w:rPr>
+          <w:b/>
+          <w:bCs/>
+          <w:color w:val="0A5346"/>
+        </w:rPr>
+        <w:t xml:space="preserve">Orateur : </w:t>
+      </w:r>
+      <w:r>
+        <w:t xml:space="preserve">Axel   </w:t>
+      </w:r>
+      <w:r>
+        <w:rPr>
+          <w:b/>
+          <w:bCs/>
+          <w:color w:val="0A5346"/>
+        </w:rPr>
+        <w:t xml:space="preserve">Durée : </w:t>
+      </w:r>
+      <w:r>
+        <w:t xml:space="preserve">1,5 min</w:t>
+      </w:r>
+    </w:p>
+    <w:p>
+      <w:pPr>
+        <w:spacing w:after="120"/>
+      </w:pPr>
+      <w:r>
+        <w:rPr>
+          <w:i/>
+          <w:iCs/>
+          <w:color w:val="666666"/>
+        </w:rPr>
+        <w:t xml:space="preserve">On boucle avec la slide 2 : chaque attente a sa réponse concrète.</w:t>
+      </w:r>
+    </w:p>
+    <w:tbl>
+      <w:tblPr>
+        <w:tblW w:type="dxa" w:w="9360"/>
+        <w:tblBorders>
+          <w:top w:val="single" w:color="CCCCCC" w:sz="4"/>
+          <w:left w:val="single" w:color="CCCCCC" w:sz="4"/>
+          <w:bottom w:val="single" w:color="CCCCCC" w:sz="4"/>
+          <w:right w:val="single" w:color="CCCCCC" w:sz="4"/>
+          <w:insideH w:val="single" w:color="CCCCCC" w:sz="4"/>
+          <w:insideV w:val="single" w:color="CCCCCC" w:sz="4"/>
+        </w:tblBorders>
+      </w:tblPr>
+      <w:tblGrid>
+        <w:gridCol w:w="3400"/>
+        <w:gridCol w:w="5960"/>
+      </w:tblGrid>
+      <w:tr>
+        <w:trPr>
+          <w:tblHeader/>
+        </w:trPr>
+        <w:tc>
+          <w:tcPr>
+            <w:tcW w:type="dxa" w:w="3400"/>
+            <w:shd w:fill="D9F0EA" w:val="clear"/>
+            <w:tcMar>
+              <w:top w:type="dxa" w:w="60"/>
+              <w:left w:type="dxa" w:w="110"/>
+              <w:bottom w:type="dxa" w:w="60"/>
+              <w:right w:type="dxa" w:w="110"/>
+            </w:tcMar>
+            <w:vAlign w:val="center"/>
+          </w:tcPr>
+          <w:p>
+            <w:pPr>
+              <w:spacing w:after="0"/>
+              <w:jc w:val="left"/>
+            </w:pPr>
+            <w:r>
+              <w:rPr>
+                <w:b/>
+                <w:bCs/>
+                <w:color w:val="0A5346"/>
+              </w:rPr>
+              <w:t xml:space="preserve">Attente du client</w:t>
+            </w:r>
+          </w:p>
+        </w:tc>
+        <w:tc>
+          <w:tcPr>
+            <w:tcW w:type="dxa" w:w="5960"/>
+            <w:shd w:fill="D9F0EA" w:val="clear"/>
+            <w:tcMar>
+              <w:top w:type="dxa" w:w="60"/>
+              <w:left w:type="dxa" w:w="110"/>
+              <w:bottom w:type="dxa" w:w="60"/>
+              <w:right w:type="dxa" w:w="110"/>
+            </w:tcMar>
+            <w:vAlign w:val="center"/>
+          </w:tcPr>
+          <w:p>
+            <w:pPr>
+              <w:spacing w:after="0"/>
+              <w:jc w:val="left"/>
+            </w:pPr>
+            <w:r>
+              <w:rPr>
+                <w:b/>
+                <w:bCs/>
+                <w:color w:val="0A5346"/>
+              </w:rPr>
+              <w:t xml:space="preserve">Réponse apportée par la solution</w:t>
+            </w:r>
+          </w:p>
+        </w:tc>
+      </w:tr>
+      <w:tr>
+        <w:tc>
+          <w:tcPr>
+            <w:tcW w:type="dxa" w:w="3400"/>
+            <w:shd w:fill="FFFFFF" w:val="clear"/>
+            <w:tcMar>
+              <w:top w:type="dxa" w:w="60"/>
+              <w:left w:type="dxa" w:w="110"/>
+              <w:bottom w:type="dxa" w:w="60"/>
+              <w:right w:type="dxa" w:w="110"/>
+            </w:tcMar>
+            <w:vAlign w:val="center"/>
+          </w:tcPr>
+          <w:p>
+            <w:pPr>
+              <w:spacing w:after="0"/>
+              <w:jc w:val="left"/>
+            </w:pPr>
+            <w:r>
+              <w:rPr>
+                <w:b w:val="false"/>
+                <w:bCs w:val="false"/>
+                <w:color w:val="000000"/>
+              </w:rPr>
+              <w:t xml:space="preserve">Capter et centraliser chaque lead</w:t>
+            </w:r>
+          </w:p>
+        </w:tc>
+        <w:tc>
+          <w:tcPr>
+            <w:tcW w:type="dxa" w:w="5960"/>
+            <w:shd w:fill="FFFFFF" w:val="clear"/>
+            <w:tcMar>
+              <w:top w:type="dxa" w:w="60"/>
+              <w:left w:type="dxa" w:w="110"/>
+              <w:bottom w:type="dxa" w:w="60"/>
+              <w:right w:type="dxa" w:w="110"/>
+            </w:tcMar>
+            <w:vAlign w:val="center"/>
+          </w:tcPr>
+          <w:p>
+            <w:pPr>
+              <w:spacing w:after="0"/>
+              <w:jc w:val="left"/>
+            </w:pPr>
+            <w:r>
+              <w:rPr>
+                <w:b w:val="false"/>
+                <w:bCs w:val="false"/>
+                <w:color w:val="000000"/>
+              </w:rPr>
+              <w:t xml:space="preserve">Chat + création automatique de la fiche (clients / demandes) en base.</w:t>
+            </w:r>
+          </w:p>
+        </w:tc>
+      </w:tr>
+      <w:tr>
+        <w:tc>
+          <w:tcPr>
+            <w:tcW w:type="dxa" w:w="3400"/>
+            <w:shd w:fill="F2F8F6" w:val="clear"/>
+            <w:tcMar>
+              <w:top w:type="dxa" w:w="60"/>
+              <w:left w:type="dxa" w:w="110"/>
+              <w:bottom w:type="dxa" w:w="60"/>
+              <w:right w:type="dxa" w:w="110"/>
+            </w:tcMar>
+            <w:vAlign w:val="center"/>
+          </w:tcPr>
+          <w:p>
+            <w:pPr>
+              <w:spacing w:after="0"/>
+              <w:jc w:val="left"/>
+            </w:pPr>
+            <w:r>
+              <w:rPr>
+                <w:b w:val="false"/>
+                <w:bCs w:val="false"/>
+                <w:color w:val="000000"/>
+              </w:rPr>
+              <w:t xml:space="preserve">Qualifier et détecter les manquants</w:t>
+            </w:r>
+          </w:p>
+        </w:tc>
+        <w:tc>
+          <w:tcPr>
+            <w:tcW w:type="dxa" w:w="5960"/>
+            <w:shd w:fill="F2F8F6" w:val="clear"/>
+            <w:tcMar>
+              <w:top w:type="dxa" w:w="60"/>
+              <w:left w:type="dxa" w:w="110"/>
+              <w:bottom w:type="dxa" w:w="60"/>
+              <w:right w:type="dxa" w:w="110"/>
+            </w:tcMar>
+            <w:vAlign w:val="center"/>
+          </w:tcPr>
+          <w:p>
+            <w:pPr>
+              <w:spacing w:after="0"/>
+              <w:jc w:val="left"/>
+            </w:pPr>
+            <w:r>
+              <w:rPr>
+                <w:b w:val="false"/>
+                <w:bCs w:val="false"/>
+                <w:color w:val="000000"/>
+              </w:rPr>
+              <w:t xml:space="preserve">Agent n8n : extraction des paramètres + questions ciblées avant devis.</w:t>
+            </w:r>
+          </w:p>
+        </w:tc>
+      </w:tr>
+      <w:tr>
+        <w:tc>
+          <w:tcPr>
+            <w:tcW w:type="dxa" w:w="3400"/>
+            <w:shd w:fill="FFFFFF" w:val="clear"/>
+            <w:tcMar>
+              <w:top w:type="dxa" w:w="60"/>
+              <w:left w:type="dxa" w:w="110"/>
+              <w:bottom w:type="dxa" w:w="60"/>
+              <w:right w:type="dxa" w:w="110"/>
+            </w:tcMar>
+            <w:vAlign w:val="center"/>
+          </w:tcPr>
+          <w:p>
+            <w:pPr>
+              <w:spacing w:after="0"/>
+              <w:jc w:val="left"/>
+            </w:pPr>
+            <w:r>
+              <w:rPr>
+                <w:b w:val="false"/>
+                <w:bCs w:val="false"/>
+                <w:color w:val="000000"/>
+              </w:rPr>
+              <w:t xml:space="preserve">Un devis juste, en quelques secondes</w:t>
+            </w:r>
+          </w:p>
+        </w:tc>
+        <w:tc>
+          <w:tcPr>
+            <w:tcW w:type="dxa" w:w="5960"/>
+            <w:shd w:fill="FFFFFF" w:val="clear"/>
+            <w:tcMar>
+              <w:top w:type="dxa" w:w="60"/>
+              <w:left w:type="dxa" w:w="110"/>
+              <w:bottom w:type="dxa" w:w="60"/>
+              <w:right w:type="dxa" w:w="110"/>
+            </w:tcMar>
+            <w:vAlign w:val="center"/>
+          </w:tcPr>
+          <w:p>
+            <w:pPr>
+              <w:spacing w:after="0"/>
+              <w:jc w:val="left"/>
+            </w:pPr>
+            <w:r>
+              <w:rPr>
+                <w:b w:val="false"/>
+                <w:bCs w:val="false"/>
+                <w:color w:val="000000"/>
+              </w:rPr>
+              <w:t xml:space="preserve">calculer_devis() déterministe + distance routière réelle, figé.</w:t>
+            </w:r>
+          </w:p>
+        </w:tc>
+      </w:tr>
+      <w:tr>
+        <w:tc>
+          <w:tcPr>
+            <w:tcW w:type="dxa" w:w="3400"/>
+            <w:shd w:fill="F2F8F6" w:val="clear"/>
+            <w:tcMar>
+              <w:top w:type="dxa" w:w="60"/>
+              <w:left w:type="dxa" w:w="110"/>
+              <w:bottom w:type="dxa" w:w="60"/>
+              <w:right w:type="dxa" w:w="110"/>
+            </w:tcMar>
+            <w:vAlign w:val="center"/>
+          </w:tcPr>
+          <w:p>
+            <w:pPr>
+              <w:spacing w:after="0"/>
+              <w:jc w:val="left"/>
+            </w:pPr>
+            <w:r>
+              <w:rPr>
+                <w:b w:val="false"/>
+                <w:bCs w:val="false"/>
+                <w:color w:val="000000"/>
+              </w:rPr>
+              <w:t xml:space="preserve">Une proposition professionnelle</w:t>
+            </w:r>
+          </w:p>
+        </w:tc>
+        <w:tc>
+          <w:tcPr>
+            <w:tcW w:type="dxa" w:w="5960"/>
+            <w:shd w:fill="F2F8F6" w:val="clear"/>
+            <w:tcMar>
+              <w:top w:type="dxa" w:w="60"/>
+              <w:left w:type="dxa" w:w="110"/>
+              <w:bottom w:type="dxa" w:w="60"/>
+              <w:right w:type="dxa" w:w="110"/>
+            </w:tcMar>
+            <w:vAlign w:val="center"/>
+          </w:tcPr>
+          <w:p>
+            <w:pPr>
+              <w:spacing w:after="0"/>
+              <w:jc w:val="left"/>
+            </w:pPr>
+            <w:r>
+              <w:rPr>
+                <w:b w:val="false"/>
+                <w:bCs w:val="false"/>
+                <w:color w:val="000000"/>
+              </w:rPr>
+              <w:t xml:space="preserve">PDF généré + email avec boutons Accepter / Refuser.</w:t>
+            </w:r>
+          </w:p>
+        </w:tc>
+      </w:tr>
+      <w:tr>
+        <w:tc>
+          <w:tcPr>
+            <w:tcW w:type="dxa" w:w="3400"/>
+            <w:shd w:fill="FFFFFF" w:val="clear"/>
+            <w:tcMar>
+              <w:top w:type="dxa" w:w="60"/>
+              <w:left w:type="dxa" w:w="110"/>
+              <w:bottom w:type="dxa" w:w="60"/>
+              <w:right w:type="dxa" w:w="110"/>
+            </w:tcMar>
+            <w:vAlign w:val="center"/>
+          </w:tcPr>
+          <w:p>
+            <w:pPr>
+              <w:spacing w:after="0"/>
+              <w:jc w:val="left"/>
+            </w:pPr>
+            <w:r>
+              <w:rPr>
+                <w:b w:val="false"/>
+                <w:bCs w:val="false"/>
+                <w:color w:val="000000"/>
+              </w:rPr>
+              <w:t xml:space="preserve">Ne plus oublier les relances</w:t>
+            </w:r>
+          </w:p>
+        </w:tc>
+        <w:tc>
+          <w:tcPr>
+            <w:tcW w:type="dxa" w:w="5960"/>
+            <w:shd w:fill="FFFFFF" w:val="clear"/>
+            <w:tcMar>
+              <w:top w:type="dxa" w:w="60"/>
+              <w:left w:type="dxa" w:w="110"/>
+              <w:bottom w:type="dxa" w:w="60"/>
+              <w:right w:type="dxa" w:w="110"/>
+            </w:tcMar>
+            <w:vAlign w:val="center"/>
+          </w:tcPr>
+          <w:p>
+            <w:pPr>
+              <w:spacing w:after="0"/>
+              <w:jc w:val="left"/>
+            </w:pPr>
+            <w:r>
+              <w:rPr>
+                <w:b w:val="false"/>
+                <w:bCs w:val="false"/>
+                <w:color w:val="000000"/>
+              </w:rPr>
+              <w:t xml:space="preserve">Séquences automatiques J+2 / J+3 / J+7 (max 2) + relance manuelle.</w:t>
+            </w:r>
+          </w:p>
+        </w:tc>
+      </w:tr>
+      <w:tr>
+        <w:tc>
+          <w:tcPr>
+            <w:tcW w:type="dxa" w:w="3400"/>
+            <w:shd w:fill="F2F8F6" w:val="clear"/>
+            <w:tcMar>
+              <w:top w:type="dxa" w:w="60"/>
+              <w:left w:type="dxa" w:w="110"/>
+              <w:bottom w:type="dxa" w:w="60"/>
+              <w:right w:type="dxa" w:w="110"/>
+            </w:tcMar>
+            <w:vAlign w:val="center"/>
+          </w:tcPr>
+          <w:p>
+            <w:pPr>
+              <w:spacing w:after="0"/>
+              <w:jc w:val="left"/>
+            </w:pPr>
+            <w:r>
+              <w:rPr>
+                <w:b w:val="false"/>
+                <w:bCs w:val="false"/>
+                <w:color w:val="000000"/>
+              </w:rPr>
+              <w:t xml:space="preserve">Donner de la visibilité à la direction</w:t>
+            </w:r>
+          </w:p>
+        </w:tc>
+        <w:tc>
+          <w:tcPr>
+            <w:tcW w:type="dxa" w:w="5960"/>
+            <w:shd w:fill="F2F8F6" w:val="clear"/>
+            <w:tcMar>
+              <w:top w:type="dxa" w:w="60"/>
+              <w:left w:type="dxa" w:w="110"/>
+              <w:bottom w:type="dxa" w:w="60"/>
+              <w:right w:type="dxa" w:w="110"/>
+            </w:tcMar>
+            <w:vAlign w:val="center"/>
+          </w:tcPr>
+          <w:p>
+            <w:pPr>
+              <w:spacing w:after="0"/>
+              <w:jc w:val="left"/>
+            </w:pPr>
+            <w:r>
+              <w:rPr>
+                <w:b w:val="false"/>
+                <w:bCs w:val="false"/>
+                <w:color w:val="000000"/>
+              </w:rPr>
+              <w:t xml:space="preserve">Dashboard /admin : KPIs, courbe, camembert des refus, export PDF.</w:t>
+            </w:r>
+          </w:p>
+        </w:tc>
+      </w:tr>
+      <w:tr>
+        <w:tc>
+          <w:tcPr>
+            <w:tcW w:type="dxa" w:w="3400"/>
+            <w:shd w:fill="FFFFFF" w:val="clear"/>
+            <w:tcMar>
+              <w:top w:type="dxa" w:w="60"/>
+              <w:left w:type="dxa" w:w="110"/>
+              <w:bottom w:type="dxa" w:w="60"/>
+              <w:right w:type="dxa" w:w="110"/>
+            </w:tcMar>
+            <w:vAlign w:val="center"/>
+          </w:tcPr>
+          <w:p>
+            <w:pPr>
+              <w:spacing w:after="0"/>
+              <w:jc w:val="left"/>
+            </w:pPr>
+            <w:r>
+              <w:rPr>
+                <w:b w:val="false"/>
+                <w:bCs w:val="false"/>
+                <w:color w:val="000000"/>
+              </w:rPr>
+              <w:t xml:space="preserve">Garder l’humain sur les cas sensibles</w:t>
+            </w:r>
+          </w:p>
+        </w:tc>
+        <w:tc>
+          <w:tcPr>
+            <w:tcW w:type="dxa" w:w="5960"/>
+            <w:shd w:fill="FFFFFF" w:val="clear"/>
+            <w:tcMar>
+              <w:top w:type="dxa" w:w="60"/>
+              <w:left w:type="dxa" w:w="110"/>
+              <w:bottom w:type="dxa" w:w="60"/>
+              <w:right w:type="dxa" w:w="110"/>
+            </w:tcMar>
+            <w:vAlign w:val="center"/>
+          </w:tcPr>
+          <w:p>
+            <w:pPr>
+              <w:spacing w:after="0"/>
+              <w:jc w:val="left"/>
+            </w:pPr>
+            <w:r>
+              <w:rPr>
+                <w:b w:val="false"/>
+                <w:bCs w:val="false"/>
+                <w:color w:val="000000"/>
+              </w:rPr>
+              <w:t xml:space="preserve">Escalade HITL (&gt; 85 pax) + messagerie bidirectionnelle client ↔ conseiller.</w:t>
+            </w:r>
+          </w:p>
+        </w:tc>
+      </w:tr>
+    </w:tbl>
+    <w:p>
+      <w:pPr>
+        <w:pBdr>
+          <w:left w:val="single" w:color="0E7A66" w:sz="18" w:space="8"/>
+        </w:pBdr>
+        <w:shd w:fill="F2F8F6" w:val="clear"/>
+        <w:spacing w:after="160" w:before="80"/>
+      </w:pPr>
+      <w:r>
+        <w:rPr>
+          <w:b/>
+          <w:bCs/>
+          <w:color w:val="0A5346"/>
+        </w:rPr>
+        <w:t xml:space="preserve">À dire : </w:t>
+      </w:r>
+      <w:r>
+        <w:t xml:space="preserve">C’est la preuve qu’on a traité le besoin du client, pas seulement construit une démo.</w:t>
+      </w:r>
+    </w:p>
+    <w:p>
+      <w:pPr>
+        <w:pStyle w:val="Heading1"/>
+      </w:pPr>
+      <w:r>
+        <w:t xml:space="preserve">Slide 10 — Ce qui fonctionne — démo live</w:t>
+      </w:r>
+    </w:p>
+    <w:p>
+      <w:pPr>
+        <w:spacing w:after="120"/>
+      </w:pPr>
+      <w:r>
+        <w:rPr>
+          <w:b/>
+          <w:bCs/>
+          <w:color w:val="0A5346"/>
+        </w:rPr>
+        <w:t xml:space="preserve">Orateur : </w:t>
+      </w:r>
+      <w:r>
+        <w:t xml:space="preserve">Zakaria   </w:t>
+      </w:r>
+    </w:p>
+    <w:p>
+      <w:pPr>
+        <w:spacing w:after="120"/>
+      </w:pPr>
+      <w:r>
+        <w:rPr>
+          <w:i/>
+          <w:iCs/>
+          <w:color w:val="666666"/>
+        </w:rPr>
+        <w:t xml:space="preserve">Démonstration du parcours complet, en conditions réelles.</w:t>
       </w:r>
     </w:p>
     <w:p>
@@ -1413,7 +3211,75 @@
         <w:spacing w:after="60"/>
       </w:pPr>
       <w:r>
-        <w:t xml:space="preserve">Espace client : Mes devis (PDF, accepter/refuser avec motifs), Mes conversations, Mon compte.</w:t>
+        <w:t xml:space="preserve">Au programme : parcours prospect · cas complexe (HITL) · espace client · dashboard admin.</w:t>
+      </w:r>
+    </w:p>
+    <w:p>
+      <w:pPr>
+        <w:pBdr>
+          <w:left w:val="single" w:color="0E7A66" w:sz="18" w:space="8"/>
+        </w:pBdr>
+        <w:shd w:fill="F2F8F6" w:val="clear"/>
+        <w:spacing w:after="160" w:before="80"/>
+      </w:pPr>
+      <w:r>
+        <w:rPr>
+          <w:b/>
+          <w:bCs/>
+          <w:color w:val="0A5346"/>
+        </w:rPr>
+        <w:t xml:space="preserve">À dire : </w:t>
+      </w:r>
+      <w:r>
+        <w:t xml:space="preserve">Transition vers la démo. Pré-requis lancés (tunnel + données propres). Filet : jeu de démo déjà en base si le chat échoue.</w:t>
+      </w:r>
+    </w:p>
+    <w:p>
+      <w:pPr>
+        <w:pStyle w:val="Heading1"/>
+      </w:pPr>
+      <w:r>
+        <w:t xml:space="preserve">Slide 11 — Démo — parcours prospect (le cœur)</w:t>
+      </w:r>
+    </w:p>
+    <w:p>
+      <w:pPr>
+        <w:spacing w:after="120"/>
+      </w:pPr>
+      <w:r>
+        <w:rPr>
+          <w:b/>
+          <w:bCs/>
+          <w:color w:val="0A5346"/>
+        </w:rPr>
+        <w:t xml:space="preserve">Orateur : </w:t>
+      </w:r>
+      <w:r>
+        <w:t xml:space="preserve">Zakaria   </w:t>
+      </w:r>
+      <w:r>
+        <w:rPr>
+          <w:b/>
+          <w:bCs/>
+          <w:color w:val="0A5346"/>
+        </w:rPr>
+        <w:t xml:space="preserve">Durée : </w:t>
+      </w:r>
+      <w:r>
+        <w:t xml:space="preserve">2 min</w:t>
+      </w:r>
+    </w:p>
+    <w:p>
+      <w:pPr>
+        <w:spacing w:after="120"/>
+      </w:pPr>
+      <w:r>
+        <w:rPr>
+          <w:i/>
+          <w:iCs/>
+          <w:color w:val="666666"/>
+        </w:rPr>
+        <w:t xml:space="preserve">Chat : « Lyon vers Annecy, 50 personnes, aller-retour le 12 juillet 2026 ».</w:t>
       </w:r>
     </w:p>
     <w:p>
@@ -1426,75 +3292,7 @@
         <w:spacing w:after="60"/>
       </w:pPr>
       <w:r>
-        <w:t xml:space="preserve">« Refuser » depuis l’email → page de motifs → relances stoppées.</w:t>
-      </w:r>
-    </w:p>
-    <w:p>
-      <w:pPr>
-        <w:pBdr>
-          <w:left w:val="single" w:color="0E7A66" w:sz="18" w:space="8"/>
-        </w:pBdr>
-        <w:shd w:fill="F2F8F6" w:val="clear"/>
-        <w:spacing w:after="160" w:before="80"/>
-      </w:pPr>
-      <w:r>
-        <w:rPr>
-          <w:b/>
-          <w:bCs/>
-          <w:color w:val="0A5346"/>
-        </w:rPr>
-        <w:t xml:space="preserve">À dire : </w:t>
-      </w:r>
-      <w:r>
-        <w:t xml:space="preserve">Souligner le différenciateur bonus : le prospect suit ses devis et son historique.</w:t>
-      </w:r>
-    </w:p>
-    <w:p>
-      <w:pPr>
-        <w:pStyle w:val="Heading1"/>
-      </w:pPr>
-      <w:r>
-        <w:t xml:space="preserve">Slide 8 — Démo — dashboard admin (pilotage)</w:t>
-      </w:r>
-    </w:p>
-    <w:p>
-      <w:pPr>
-        <w:spacing w:after="120"/>
-      </w:pPr>
-      <w:r>
-        <w:rPr>
-          <w:b/>
-          <w:bCs/>
-          <w:color w:val="0A5346"/>
-        </w:rPr>
-        <w:t xml:space="preserve">Orateur : </w:t>
-      </w:r>
-      <w:r>
-        <w:t xml:space="preserve">Zakaria   </w:t>
-      </w:r>
-      <w:r>
-        <w:rPr>
-          <w:b/>
-          <w:bCs/>
-          <w:color w:val="0A5346"/>
-        </w:rPr>
-        <w:t xml:space="preserve">Durée : </w:t>
-      </w:r>
-      <w:r>
-        <w:t xml:space="preserve">2 min</w:t>
-      </w:r>
-    </w:p>
-    <w:p>
-      <w:pPr>
-        <w:spacing w:after="120"/>
-      </w:pPr>
-      <w:r>
-        <w:rPr>
-          <w:i/>
-          <w:iCs/>
-          <w:color w:val="666666"/>
-        </w:rPr>
-        <w:t xml:space="preserve">Connexion admin → /admin.</w:t>
+        <w:t xml:space="preserve">La barre « Votre demande » se remplit en direct ; l’agent demande l’email.</w:t>
       </w:r>
     </w:p>
     <w:p>
@@ -1507,7 +3305,7 @@
         <w:spacing w:after="60"/>
       </w:pPr>
       <w:r>
-        <w:t xml:space="preserve">KPIs, courbe d’évolution, camembert des motifs de refus, filtre par dates, export PDF.</w:t>
+        <w:t xml:space="preserve">Carte devis affichée + email reçu (PDF + boutons Accepter / Refuser).</w:t>
       </w:r>
     </w:p>
     <w:p>
@@ -1520,7 +3318,75 @@
         <w:spacing w:after="60"/>
       </w:pPr>
       <w:r>
-        <w:t xml:space="preserve">Cas complexe → devis sur-mesure (prix HT → TVA/TTC → envoi) → rejoint le pipeline.</w:t>
+        <w:t xml:space="preserve">Phrase clé : le prix vient du moteur, pas de l’IA ; la distance est la vraie distance routière.</w:t>
+      </w:r>
+    </w:p>
+    <w:p>
+      <w:pPr>
+        <w:pBdr>
+          <w:left w:val="single" w:color="0E7A66" w:sz="18" w:space="8"/>
+        </w:pBdr>
+        <w:shd w:fill="F2F8F6" w:val="clear"/>
+        <w:spacing w:after="160" w:before="80"/>
+      </w:pPr>
+      <w:r>
+        <w:rPr>
+          <w:b/>
+          <w:bCs/>
+          <w:color w:val="0A5346"/>
+        </w:rPr>
+        <w:t xml:space="preserve">À dire : </w:t>
+      </w:r>
+      <w:r>
+        <w:t xml:space="preserve">Si Gemma renvoie un 503 ponctuel, renvoyer le message. Garder le filet : devis de démo déjà en base.</w:t>
+      </w:r>
+    </w:p>
+    <w:p>
+      <w:pPr>
+        <w:pStyle w:val="Heading1"/>
+      </w:pPr>
+      <w:r>
+        <w:t xml:space="preserve">Slide 12 — Démo — cas complexe (HITL)</w:t>
+      </w:r>
+    </w:p>
+    <w:p>
+      <w:pPr>
+        <w:spacing w:after="120"/>
+      </w:pPr>
+      <w:r>
+        <w:rPr>
+          <w:b/>
+          <w:bCs/>
+          <w:color w:val="0A5346"/>
+        </w:rPr>
+        <w:t xml:space="preserve">Orateur : </w:t>
+      </w:r>
+      <w:r>
+        <w:t xml:space="preserve">Zakaria   </w:t>
+      </w:r>
+      <w:r>
+        <w:rPr>
+          <w:b/>
+          <w:bCs/>
+          <w:color w:val="0A5346"/>
+        </w:rPr>
+        <w:t xml:space="preserve">Durée : </w:t>
+      </w:r>
+      <w:r>
+        <w:t xml:space="preserve">1 min</w:t>
+      </w:r>
+    </w:p>
+    <w:p>
+      <w:pPr>
+        <w:spacing w:after="120"/>
+      </w:pPr>
+      <w:r>
+        <w:rPr>
+          <w:i/>
+          <w:iCs/>
+          <w:color w:val="666666"/>
+        </w:rPr>
+        <w:t xml:space="preserve">Chat : « Marseille vers Lille, 120 personnes ».</w:t>
       </w:r>
     </w:p>
     <w:p>
@@ -1533,75 +3399,7 @@
         <w:spacing w:after="60"/>
       </w:pPr>
       <w:r>
-        <w:t xml:space="preserve">Messagerie HITL bidirectionnelle ; « Lancer les relances dues ».</w:t>
-      </w:r>
-    </w:p>
-    <w:p>
-      <w:pPr>
-        <w:pBdr>
-          <w:left w:val="single" w:color="0E7A66" w:sz="18" w:space="8"/>
-        </w:pBdr>
-        <w:shd w:fill="F2F8F6" w:val="clear"/>
-        <w:spacing w:after="160" w:before="80"/>
-      </w:pPr>
-      <w:r>
-        <w:rPr>
-          <w:b/>
-          <w:bCs/>
-          <w:color w:val="0A5346"/>
-        </w:rPr>
-        <w:t xml:space="preserve">À dire : </w:t>
-      </w:r>
-      <w:r>
-        <w:t xml:space="preserve">C’est la preuve du pilotage par la donnée : la direction voit tout en temps réel.</w:t>
-      </w:r>
-    </w:p>
-    <w:p>
-      <w:pPr>
-        <w:pStyle w:val="Heading1"/>
-      </w:pPr>
-      <w:r>
-        <w:t xml:space="preserve">Slide 9 — Fiabilité &amp; garde-fous</w:t>
-      </w:r>
-    </w:p>
-    <w:p>
-      <w:pPr>
-        <w:spacing w:after="120"/>
-      </w:pPr>
-      <w:r>
-        <w:rPr>
-          <w:b/>
-          <w:bCs/>
-          <w:color w:val="0A5346"/>
-        </w:rPr>
-        <w:t xml:space="preserve">Orateur : </w:t>
-      </w:r>
-      <w:r>
-        <w:t xml:space="preserve">Vincent   </w:t>
-      </w:r>
-      <w:r>
-        <w:rPr>
-          <w:b/>
-          <w:bCs/>
-          <w:color w:val="0A5346"/>
-        </w:rPr>
-        <w:t xml:space="preserve">Durée : </w:t>
-      </w:r>
-      <w:r>
-        <w:t xml:space="preserve">1,5 min</w:t>
-      </w:r>
-    </w:p>
-    <w:p>
-      <w:pPr>
-        <w:spacing w:after="120"/>
-      </w:pPr>
-      <w:r>
-        <w:rPr>
-          <w:i/>
-          <w:iCs/>
-          <w:color w:val="666666"/>
-        </w:rPr>
-        <w:t xml:space="preserve">Un système sûr, juste et auditable.</w:t>
+        <w:t xml:space="preserve">Au-delà de 85 passagers → message d’escalade, pas de devis automatique.</w:t>
       </w:r>
     </w:p>
     <w:p>
@@ -1614,7 +3412,75 @@
         <w:spacing w:after="60"/>
       </w:pPr>
       <w:r>
-        <w:t xml:space="preserve">Prix 100 % déterministe (calculer_devis() testé) ; 1ᵉʳ prix figé.</w:t>
+        <w:t xml:space="preserve">La demande devient un cas complexe transmis à un humain avec le contexte.</w:t>
+      </w:r>
+    </w:p>
+    <w:p>
+      <w:pPr>
+        <w:pBdr>
+          <w:left w:val="single" w:color="0E7A66" w:sz="18" w:space="8"/>
+        </w:pBdr>
+        <w:shd w:fill="F2F8F6" w:val="clear"/>
+        <w:spacing w:after="160" w:before="80"/>
+      </w:pPr>
+      <w:r>
+        <w:rPr>
+          <w:b/>
+          <w:bCs/>
+          <w:color w:val="0A5346"/>
+        </w:rPr>
+        <w:t xml:space="preserve">À dire : </w:t>
+      </w:r>
+      <w:r>
+        <w:t xml:space="preserve">Montrer que le système sait dire « non » à l’automatisation totale : c’est un gage de fiabilité, pas une limite.</w:t>
+      </w:r>
+    </w:p>
+    <w:p>
+      <w:pPr>
+        <w:pStyle w:val="Heading1"/>
+      </w:pPr>
+      <w:r>
+        <w:t xml:space="preserve">Slide 13 — Démo — côté client</w:t>
+      </w:r>
+    </w:p>
+    <w:p>
+      <w:pPr>
+        <w:spacing w:after="120"/>
+      </w:pPr>
+      <w:r>
+        <w:rPr>
+          <w:b/>
+          <w:bCs/>
+          <w:color w:val="0A5346"/>
+        </w:rPr>
+        <w:t xml:space="preserve">Orateur : </w:t>
+      </w:r>
+      <w:r>
+        <w:t xml:space="preserve">Zakaria   </w:t>
+      </w:r>
+      <w:r>
+        <w:rPr>
+          <w:b/>
+          <w:bCs/>
+          <w:color w:val="0A5346"/>
+        </w:rPr>
+        <w:t xml:space="preserve">Durée : </w:t>
+      </w:r>
+      <w:r>
+        <w:t xml:space="preserve">1,5 min</w:t>
+      </w:r>
+    </w:p>
+    <w:p>
+      <w:pPr>
+        <w:spacing w:after="120"/>
+      </w:pPr>
+      <w:r>
+        <w:rPr>
+          <w:i/>
+          <w:iCs/>
+          <w:color w:val="666666"/>
+        </w:rPr>
+        <w:t xml:space="preserve">De l’email à l’espace client.</w:t>
       </w:r>
     </w:p>
     <w:p>
@@ -1627,7 +3493,7 @@
         <w:spacing w:after="60"/>
       </w:pPr>
       <w:r>
-        <w:t xml:space="preserve">Jeu de tests : cas types ET cas limites (0 passager, date incohérente, gros volume…).</w:t>
+        <w:t xml:space="preserve">Bouton « Accepter » d’un email sans compte → inscription pré-remplie.</w:t>
       </w:r>
     </w:p>
     <w:p>
@@ -1640,75 +3506,7 @@
         <w:spacing w:after="60"/>
       </w:pPr>
       <w:r>
-        <w:t xml:space="preserve">RGPD (minimisation, domaine de démo sans envoi réel) ; prompt injection (le code ne négocie jamais le prix) ; HITL.</w:t>
-      </w:r>
-    </w:p>
-    <w:p>
-      <w:pPr>
-        <w:pBdr>
-          <w:left w:val="single" w:color="0E7A66" w:sz="18" w:space="8"/>
-        </w:pBdr>
-        <w:shd w:fill="F2F8F6" w:val="clear"/>
-        <w:spacing w:after="160" w:before="80"/>
-      </w:pPr>
-      <w:r>
-        <w:rPr>
-          <w:b/>
-          <w:bCs/>
-          <w:color w:val="0A5346"/>
-        </w:rPr>
-        <w:t xml:space="preserve">À dire : </w:t>
-      </w:r>
-      <w:r>
-        <w:t xml:space="preserve">Montrer rapidement npm test qui passe, et /docs (Swagger) : « toute l’API est documentée et explorable ».</w:t>
-      </w:r>
-    </w:p>
-    <w:p>
-      <w:pPr>
-        <w:pStyle w:val="Heading1"/>
-      </w:pPr>
-      <w:r>
-        <w:t xml:space="preserve">Slide 10 — Choix techniques défendus</w:t>
-      </w:r>
-    </w:p>
-    <w:p>
-      <w:pPr>
-        <w:spacing w:after="120"/>
-      </w:pPr>
-      <w:r>
-        <w:rPr>
-          <w:b/>
-          <w:bCs/>
-          <w:color w:val="0A5346"/>
-        </w:rPr>
-        <w:t xml:space="preserve">Orateur : </w:t>
-      </w:r>
-      <w:r>
-        <w:t xml:space="preserve">Vincent   </w:t>
-      </w:r>
-      <w:r>
-        <w:rPr>
-          <w:b/>
-          <w:bCs/>
-          <w:color w:val="0A5346"/>
-        </w:rPr>
-        <w:t xml:space="preserve">Durée : </w:t>
-      </w:r>
-      <w:r>
-        <w:t xml:space="preserve">1,5 min</w:t>
-      </w:r>
-    </w:p>
-    <w:p>
-      <w:pPr>
-        <w:spacing w:after="120"/>
-      </w:pPr>
-      <w:r>
-        <w:rPr>
-          <w:i/>
-          <w:iCs/>
-          <w:color w:val="666666"/>
-        </w:rPr>
-        <w:t xml:space="preserve">Pourquoi ces décisions.</w:t>
+        <w:t xml:space="preserve">Espace client : Mes devis (PDF, accepter/refuser avec motifs), Mes conversations, Mon compte.</w:t>
       </w:r>
     </w:p>
     <w:p>
@@ -1721,7 +3519,75 @@
         <w:spacing w:after="60"/>
       </w:pPr>
       <w:r>
-        <w:t xml:space="preserve">n8n (Option A) : orchestration visuelle + relances intégrées.</w:t>
+        <w:t xml:space="preserve">« Refuser » depuis l’email → page de motifs → relances stoppées.</w:t>
+      </w:r>
+    </w:p>
+    <w:p>
+      <w:pPr>
+        <w:pBdr>
+          <w:left w:val="single" w:color="0E7A66" w:sz="18" w:space="8"/>
+        </w:pBdr>
+        <w:shd w:fill="F2F8F6" w:val="clear"/>
+        <w:spacing w:after="160" w:before="80"/>
+      </w:pPr>
+      <w:r>
+        <w:rPr>
+          <w:b/>
+          <w:bCs/>
+          <w:color w:val="0A5346"/>
+        </w:rPr>
+        <w:t xml:space="preserve">À dire : </w:t>
+      </w:r>
+      <w:r>
+        <w:t xml:space="preserve">Souligner le différenciateur (bonus livré) : le prospect suit ses devis et son historique.</w:t>
+      </w:r>
+    </w:p>
+    <w:p>
+      <w:pPr>
+        <w:pStyle w:val="Heading1"/>
+      </w:pPr>
+      <w:r>
+        <w:t xml:space="preserve">Slide 14 — Démo — dashboard admin (pilotage)</w:t>
+      </w:r>
+    </w:p>
+    <w:p>
+      <w:pPr>
+        <w:spacing w:after="120"/>
+      </w:pPr>
+      <w:r>
+        <w:rPr>
+          <w:b/>
+          <w:bCs/>
+          <w:color w:val="0A5346"/>
+        </w:rPr>
+        <w:t xml:space="preserve">Orateur : </w:t>
+      </w:r>
+      <w:r>
+        <w:t xml:space="preserve">Zakaria   </w:t>
+      </w:r>
+      <w:r>
+        <w:rPr>
+          <w:b/>
+          <w:bCs/>
+          <w:color w:val="0A5346"/>
+        </w:rPr>
+        <w:t xml:space="preserve">Durée : </w:t>
+      </w:r>
+      <w:r>
+        <w:t xml:space="preserve">2 min</w:t>
+      </w:r>
+    </w:p>
+    <w:p>
+      <w:pPr>
+        <w:spacing w:after="120"/>
+      </w:pPr>
+      <w:r>
+        <w:rPr>
+          <w:i/>
+          <w:iCs/>
+          <w:color w:val="666666"/>
+        </w:rPr>
+        <w:t xml:space="preserve">Connexion admin → /admin.</w:t>
       </w:r>
     </w:p>
     <w:p>
@@ -1734,7 +3600,7 @@
         <w:spacing w:after="60"/>
       </w:pPr>
       <w:r>
-        <w:t xml:space="preserve">Un seul appel LLM : rapide, fiable, économe.</w:t>
+        <w:t xml:space="preserve">KPIs, courbe d’évolution, camembert des motifs de refus, filtre par dates, export PDF.</w:t>
       </w:r>
     </w:p>
     <w:p>
@@ -1747,7 +3613,7 @@
         <w:spacing w:after="60"/>
       </w:pPr>
       <w:r>
-        <w:t xml:space="preserve">Supabase plutôt qu’Airtable : base + Auth + RLS dans une seule stack (dashboard custom sans surcoût).</w:t>
+        <w:t xml:space="preserve">Cas complexe → devis sur-mesure (prix HT → TVA/TTC → envoi) → rejoint le pipeline.</w:t>
       </w:r>
     </w:p>
     <w:p>
@@ -1760,7 +3626,7 @@
         <w:spacing w:after="60"/>
       </w:pPr>
       <w:r>
-        <w:t xml:space="preserve">Gemma (gratuit) : rôle d’assistance uniquement.</w:t>
+        <w:t xml:space="preserve">Messagerie HITL bidirectionnelle ; « Lancer les relances dues ».</w:t>
       </w:r>
     </w:p>
     <w:p>
@@ -1780,7 +3646,7 @@
         <w:t xml:space="preserve">À dire : </w:t>
       </w:r>
       <w:r>
-        <w:t xml:space="preserve">Renvoyer à l’« Argumentaire des choix » (L1) pour le détail des décisions.</w:t>
+        <w:t xml:space="preserve">C’est la preuve du pilotage par la donnée : la direction voit tout en temps réel.</w:t>
       </w:r>
     </w:p>
     <w:p>
@@ -1788,7 +3654,7 @@
         <w:pStyle w:val="Heading1"/>
       </w:pPr>
       <w:r>
-        <w:t xml:space="preserve">Slide 11 — Limites &amp; arbitrages assumés</w:t>
+        <w:t xml:space="preserve">Slide 15 — Limites, MVP vs prod &amp; coûts</w:t>
       </w:r>
     </w:p>
     <w:p>
@@ -1815,7 +3681,7 @@
         <w:t xml:space="preserve">Durée : </w:t>
       </w:r>
       <w:r>
-        <w:t xml:space="preserve">1 min</w:t>
+        <w:t xml:space="preserve">1,5 min</w:t>
       </w:r>
     </w:p>
     <w:p>
@@ -1828,7 +3694,7 @@
           <w:iCs/>
           <w:color w:val="666666"/>
         </w:rPr>
-        <w:t xml:space="preserve">Ce qu’on assume, et pourquoi.</w:t>
+        <w:t xml:space="preserve">Ce qu’on assume, et le passage en production.</w:t>
       </w:r>
     </w:p>
     <w:p>
@@ -1854,7 +3720,7 @@
         <w:spacing w:after="60"/>
       </w:pPr>
       <w:r>
-        <w:t xml:space="preserve">Périmètre : prototype cohérent de bout en bout, pas une app de production (cas limites non exhaustifs).</w:t>
+        <w:t xml:space="preserve">Prototype cohérent de bout en bout, pas une app de production (cas limites non exhaustifs) ; péages forfaitaires (P2).</w:t>
       </w:r>
     </w:p>
     <w:p>
@@ -1867,7 +3733,7 @@
         <w:spacing w:after="60"/>
       </w:pPr>
       <w:r>
-        <w:t xml:space="preserve">Distance estimée/réelle au MVP ; péages forfaitaires (P2).</w:t>
+        <w:t xml:space="preserve">Coûts : ~0 €/mois (MVP) · ~0-1 €/mois (éco 24/7, n8n Oracle Free) · ~30 €/mois (prod sereine, recommandée).</w:t>
       </w:r>
     </w:p>
     <w:p>
@@ -1887,7 +3753,7 @@
         <w:t xml:space="preserve">À dire : </w:t>
       </w:r>
       <w:r>
-        <w:t xml:space="preserve">Assumer franchement : la cohérence du parcours prime sur la perfection d’un maillon.</w:t>
+        <w:t xml:space="preserve">Assumer franchement : la cohérence du parcours prime sur la perfection d’un maillon. Le seul élément à changer pour la prod : héberger n8n. 4 scénarios chiffrés dans COUTS_ET_PROD.md.</w:t>
       </w:r>
     </w:p>
     <w:p>
@@ -1895,7 +3761,7 @@
         <w:pStyle w:val="Heading1"/>
       </w:pPr>
       <w:r>
-        <w:t xml:space="preserve">Slide 12 — MVP vs prod &amp; coûts</w:t>
+        <w:t xml:space="preserve">Slide 16 — Ouverture vers une V2 &amp; passation livrée</w:t>
       </w:r>
     </w:p>
     <w:p>
@@ -1922,7 +3788,7 @@
         <w:t xml:space="preserve">Durée : </w:t>
       </w:r>
       <w:r>
-        <w:t xml:space="preserve">1 min</w:t>
+        <w:t xml:space="preserve">1,5 min</w:t>
       </w:r>
     </w:p>
     <w:p>
@@ -1935,7 +3801,7 @@
           <w:iCs/>
           <w:color w:val="666666"/>
         </w:rPr>
-        <w:t xml:space="preserve">Du 0 € à la prod sereine.</w:t>
+        <w:t xml:space="preserve">Le projet a une suite claire et il est déjà reprenable.</w:t>
       </w:r>
     </w:p>
     <w:p>
@@ -1948,7 +3814,7 @@
         <w:spacing w:after="60"/>
       </w:pPr>
       <w:r>
-        <w:t xml:space="preserve">Aujourd’hui (MVP) : ~0 €/mois (tunnel local).</w:t>
+        <w:t xml:space="preserve">Ouverture V2 — P1 : héberger n8n 24/7 + Supabase Pro (base toujours active).</w:t>
       </w:r>
     </w:p>
     <w:p>
@@ -1961,7 +3827,7 @@
         <w:spacing w:after="60"/>
       </w:pPr>
       <w:r>
-        <w:t xml:space="preserve">Prod « éco » 24/7 : ~0-1 €/mois (n8n sur Oracle Free).</w:t>
+        <w:t xml:space="preserve">Ouverture V2 — P2 : distance &amp; péages enrichis par trajet, observabilité coût/tokens par devis, notifications internes (urgent, cas complexe).</w:t>
       </w:r>
     </w:p>
     <w:p>
@@ -1974,7 +3840,20 @@
         <w:spacing w:after="60"/>
       </w:pPr>
       <w:r>
-        <w:t xml:space="preserve">Prod « sereine » recommandée : ~30 €/mois (Supabase Pro + n8n hébergé).</w:t>
+        <w:t xml:space="preserve">Ouverture V2 — P3 : canal WhatsApp officiel, A/B testing des relances, rôles fins (commercial / manager).</w:t>
+      </w:r>
+    </w:p>
+    <w:p>
+      <w:pPr>
+        <w:pStyle w:val="ListParagraph"/>
+        <w:numPr>
+          <w:ilvl w:val="0"/>
+          <w:numId w:val="2"/>
+        </w:numPr>
+        <w:spacing w:after="60"/>
+      </w:pPr>
+      <w:r>
+        <w:t xml:space="preserve">Passation livrée (L3) : procédure repreneur (5 min), procédure équipe (termes en clair), maintenance (pricing, emails, statuts, relances), backlog ; + README, Swagger /docs, TypeDoc.</w:t>
       </w:r>
     </w:p>
     <w:p>
@@ -1994,7 +3873,7 @@
         <w:t xml:space="preserve">À dire : </w:t>
       </w:r>
       <w:r>
-        <w:t xml:space="preserve">Détails et 4 scénarios chiffrés dans COUTS_ET_PROD.md. Le seul élément à changer pour la prod : héberger n8n.</w:t>
+        <w:t xml:space="preserve">Deux messages : (1) le projet a une suite priorisée, (2) il vit déjà sans nous grâce à la doc de passation L3. Répond au critère « rendre la solution reprenable ».</w:t>
       </w:r>
     </w:p>
     <w:p>
@@ -2002,7 +3881,7 @@
         <w:pStyle w:val="Heading1"/>
       </w:pPr>
       <w:r>
-        <w:t xml:space="preserve">Slide 13 — Clôture &amp; questions</w:t>
+        <w:t xml:space="preserve">Slide 17 — Clôture &amp; questions</w:t>
       </w:r>
     </w:p>
     <w:p>

</xml_diff>